<commit_message>
Simplify team handover guide
</commit_message>
<xml_diff>
--- a/deliverables/BRING_Care_팀_운영_인수인계서_20260803.docx
+++ b/deliverables/BRING_Care_팀_운영_인수인계서_20260803.docx
@@ -215,7 +215,7 @@
                 <w:color w:val="17365D"/>
                 <w:sz w:val="17"/>
               </w:rPr>
-              <w:t>Apps Script</w:t>
+              <w:t>대상</w:t>
             </w:r>
           </w:p>
         </w:tc>
@@ -241,7 +241,7 @@
                 <w:color w:val="1F2937"/>
                 <w:sz w:val="17"/>
               </w:rPr>
-              <w:t>complaint-workflow-20260730-v52</w:t>
+              <w:t>BRING Care 운영팀</w:t>
             </w:r>
           </w:p>
         </w:tc>
@@ -438,7 +438,7 @@
           <w:color w:val="1F2937"/>
           <w:sz w:val="22"/>
         </w:rPr>
-        <w:t>세입자가 Google Form 또는 카카오 챗봇으로 민원을 접수하면 Apps Script가 계약 건물과 민원을 연결하고, 접수 안내·상담 요약·업체 분류·견적 비교·건물주 승인까지 처리한 뒤 Firebase 케이스를 GitHub Pages 관리자 화면에 실시간으로 보여주는 시스템입니다.</w:t>
+        <w:t>세입자가 Google Form 또는 카카오 챗봇으로 민원을 접수하면 자동화 시스템이 계약 건물과 민원을 연결하고, 접수 안내·상담 요약·업체 분류·견적 비교·건물주 승인까지 처리한 뒤 케이스를 관리자 화면에 실시간으로 보여주는 시스템입니다.</w:t>
       </w:r>
     </w:p>
     <w:p>
@@ -865,7 +865,7 @@
                 <w:color w:val="1F2937"/>
                 <w:sz w:val="17"/>
               </w:rPr>
-              <w:t>Apps Script 웹 앱</w:t>
+              <w:t>건물지도</w:t>
             </w:r>
           </w:p>
         </w:tc>
@@ -893,7 +893,7 @@
                   <w:color w:val="2E74B5"/>
                   <w:u w:val="single"/>
                 </w:rPr>
-                <w:t>https://script.google.com/macros/s/AKfycbxGAdtEDoNifxkM-e_Jm7dBkCnjM4oPJqz8RxZXoMoSKod5M_m9Yj2b11-nI97zmfd6Jw/exec</w:t>
+                <w:t>https://bringengineering.github.io/FM/wonju-map.html</w:t>
               </w:r>
             </w:hyperlink>
           </w:p>
@@ -921,7 +921,7 @@
                 <w:color w:val="1F2937"/>
                 <w:sz w:val="17"/>
               </w:rPr>
-              <w:t>문자, 파일 업로드, 승인 화면, 자동화 API</w:t>
+              <w:t>원주 유지보수 업체 확인</w:t>
             </w:r>
           </w:p>
         </w:tc>
@@ -953,7 +953,7 @@
                 <w:color w:val="1F2937"/>
                 <w:sz w:val="17"/>
               </w:rPr>
-              <w:t>건물지도</w:t>
+              <w:t>Firebase DB</w:t>
             </w:r>
           </w:p>
         </w:tc>
@@ -980,7 +980,7 @@
                   <w:color w:val="2E74B5"/>
                   <w:u w:val="single"/>
                 </w:rPr>
-                <w:t>https://bringengineering.github.io/FM/wonju-map.html</w:t>
+                <w:t>https://bring-fm-hj-default-rtdb.asia-southeast1.firebasedatabase.app</w:t>
               </w:r>
             </w:hyperlink>
           </w:p>
@@ -1007,7 +1007,7 @@
                 <w:color w:val="1F2937"/>
                 <w:sz w:val="17"/>
               </w:rPr>
-              <w:t>원주 유지보수 업체 확인</w:t>
+              <w:t>케이스·설정·입금 캘린더 데이터</w:t>
             </w:r>
           </w:p>
         </w:tc>
@@ -1040,7 +1040,7 @@
                 <w:color w:val="1F2937"/>
                 <w:sz w:val="17"/>
               </w:rPr>
-              <w:t>Firebase DB</w:t>
+              <w:t>Kakao 채널</w:t>
             </w:r>
           </w:p>
         </w:tc>
@@ -1068,7 +1068,7 @@
                   <w:color w:val="2E74B5"/>
                   <w:u w:val="single"/>
                 </w:rPr>
-                <w:t>https://bring-fm-hj-default-rtdb.asia-southeast1.firebasedatabase.app</w:t>
+                <w:t>http://pf.kakao.com/_xnaRfX</w:t>
               </w:r>
             </w:hyperlink>
           </w:p>
@@ -1077,92 +1077,6 @@
           <w:tcPr>
             <w:tcW w:type="dxa" w:w="3960"/>
             <w:shd w:fill="F8FAFC"/>
-            <w:tcMar>
-              <w:top w:w="80" w:type="dxa"/>
-              <w:start w:w="120" w:type="dxa"/>
-              <w:bottom w:w="80" w:type="dxa"/>
-              <w:end w:w="120" w:type="dxa"/>
-            </w:tcMar>
-            <w:vAlign w:val="center"/>
-          </w:tcPr>
-          <w:p>
-            <w:pPr>
-              <w:spacing w:after="0" w:line="259" w:lineRule="auto"/>
-            </w:pPr>
-            <w:r/>
-            <w:r>
-              <w:rPr>
-                <w:rFonts w:ascii="Calibri" w:hAnsi="Calibri" w:eastAsia="Malgun Gothic"/>
-                <w:color w:val="1F2937"/>
-                <w:sz w:val="17"/>
-              </w:rPr>
-              <w:t>케이스·설정·입금 캘린더 데이터</w:t>
-            </w:r>
-          </w:p>
-        </w:tc>
-      </w:tr>
-      <w:tr>
-        <w:trPr>
-          <w:cantSplit/>
-        </w:trPr>
-        <w:tc>
-          <w:tcPr>
-            <w:tcW w:type="dxa" w:w="1700"/>
-            <w:tcMar>
-              <w:top w:w="80" w:type="dxa"/>
-              <w:start w:w="120" w:type="dxa"/>
-              <w:bottom w:w="80" w:type="dxa"/>
-              <w:end w:w="120" w:type="dxa"/>
-            </w:tcMar>
-            <w:vAlign w:val="center"/>
-          </w:tcPr>
-          <w:p>
-            <w:pPr>
-              <w:spacing w:after="0" w:line="259" w:lineRule="auto"/>
-              <w:jc w:val="center"/>
-            </w:pPr>
-            <w:r/>
-            <w:r>
-              <w:rPr>
-                <w:rFonts w:ascii="Calibri" w:hAnsi="Calibri" w:eastAsia="Malgun Gothic"/>
-                <w:color w:val="1F2937"/>
-                <w:sz w:val="17"/>
-              </w:rPr>
-              <w:t>Kakao 채널</w:t>
-            </w:r>
-          </w:p>
-        </w:tc>
-        <w:tc>
-          <w:tcPr>
-            <w:tcW w:type="dxa" w:w="3700"/>
-            <w:tcMar>
-              <w:top w:w="80" w:type="dxa"/>
-              <w:start w:w="120" w:type="dxa"/>
-              <w:bottom w:w="80" w:type="dxa"/>
-              <w:end w:w="120" w:type="dxa"/>
-            </w:tcMar>
-            <w:vAlign w:val="center"/>
-          </w:tcPr>
-          <w:p>
-            <w:pPr>
-              <w:spacing w:after="0" w:line="259" w:lineRule="auto"/>
-            </w:pPr>
-            <w:r/>
-            <w:hyperlink r:id="rId17">
-              <w:r>
-                <w:rPr>
-                  <w:rFonts w:ascii="Calibri" w:hAnsi="Calibri" w:eastAsia="Malgun Gothic"/>
-                  <w:color w:val="2E74B5"/>
-                  <w:u w:val="single"/>
-                </w:rPr>
-                <w:t>http://pf.kakao.com/_xnaRfX</w:t>
-              </w:r>
-            </w:hyperlink>
-          </w:p>
-        </w:tc>
-        <w:tc>
-          <w:tcPr>
-            <w:tcW w:type="dxa" w:w="3960"/>
             <w:tcMar>
               <w:top w:w="80" w:type="dxa"/>
               <w:start w:w="120" w:type="dxa"/>
@@ -1440,7 +1354,7 @@
                 <w:color w:val="1F2937"/>
                 <w:sz w:val="17"/>
               </w:rPr>
-              <w:t>자동화 관리자</w:t>
+              <w:t>시스템 관리자</w:t>
             </w:r>
           </w:p>
         </w:tc>
@@ -1467,7 +1381,7 @@
                 <w:color w:val="1F2937"/>
                 <w:sz w:val="17"/>
               </w:rPr>
-              <w:t>Apps Script 설정·재배포, 트리거·실행 로그 확인</w:t>
+              <w:t>연동 상태·발송 결과·오류 기록 확인</w:t>
             </w:r>
           </w:p>
         </w:tc>
@@ -1494,7 +1408,7 @@
                 <w:color w:val="1F2937"/>
                 <w:sz w:val="17"/>
               </w:rPr>
-              <w:t>응답 시트 편집자, Apps Script 편집, Drive 편집</w:t>
+              <w:t>응답 시트 편집자, Drive 편집, 관련 서비스 콘솔</w:t>
             </w:r>
           </w:p>
         </w:tc>
@@ -1938,7 +1852,7 @@
           <w:color w:val="2E74B5"/>
           <w:sz w:val="26"/>
         </w:rPr>
-        <w:t>4.2 자동화 관리자 추가 권한</w:t>
+        <w:t>4.2 시스템 관리자 추가 권한</w:t>
       </w:r>
     </w:p>
     <w:p>
@@ -1980,35 +1894,6 @@
           <w:color w:val="1F2937"/>
           <w:sz w:val="21"/>
         </w:rPr>
-        <w:t xml:space="preserve">응답 시트의 </w:t>
-      </w:r>
-      <w:r>
-        <w:rPr>
-          <w:rFonts w:ascii="Consolas" w:hAnsi="Consolas" w:eastAsia="Malgun Gothic"/>
-          <w:color w:val="1F4D78"/>
-          <w:sz w:val="21"/>
-        </w:rPr>
-        <w:t>확장 프로그램 → Apps Script</w:t>
-      </w:r>
-      <w:r>
-        <w:rPr>
-          <w:rFonts w:ascii="Calibri" w:hAnsi="Calibri" w:eastAsia="Malgun Gothic"/>
-          <w:color w:val="1F2937"/>
-          <w:sz w:val="21"/>
-        </w:rPr>
-        <w:t>가 열리는지 확인합니다.</w:t>
-      </w:r>
-    </w:p>
-    <w:p>
-      <w:pPr>
-        <w:pStyle w:val="ListNumber"/>
-      </w:pPr>
-      <w:r>
-        <w:rPr>
-          <w:rFonts w:ascii="Calibri" w:hAnsi="Calibri" w:eastAsia="Malgun Gothic"/>
-          <w:color w:val="1F2937"/>
-          <w:sz w:val="21"/>
-        </w:rPr>
         <w:t>온보딩·견적·사업자등록증 Drive 폴더에 편집 권한을 부여합니다.</w:t>
       </w:r>
     </w:p>
@@ -2022,7 +1907,7 @@
           <w:color w:val="1F2937"/>
           <w:sz w:val="21"/>
         </w:rPr>
-        <w:t>Apps Script 실행 권한 승인과 웹 앱 배포는 자동화 책임자만 수행합니다.</w:t>
+        <w:t>네이버클라우드 SENS, Kakao, Firebase Console 권한은 업무상 필요한 사람에게만 별도로 초대합니다.</w:t>
       </w:r>
     </w:p>
     <w:p>
@@ -2035,7 +1920,7 @@
           <w:color w:val="1F2937"/>
           <w:sz w:val="21"/>
         </w:rPr>
-        <w:t>네이버클라우드 SENS, Kakao, Firebase Console 권한은 업무상 필요한 사람에게만 별도로 초대합니다.</w:t>
+        <w:t>권한을 부여한 뒤 테스트 케이스로 문자 발송, 파일 열람, 단계 전환을 확인합니다.</w:t>
       </w:r>
     </w:p>
     <w:p>
@@ -2132,23 +2017,7 @@
           <w:color w:val="1F2937"/>
           <w:sz w:val="21"/>
         </w:rPr>
-        <w:t xml:space="preserve">비밀키는 GitHub에 기록하지 않고 Apps Script </w:t>
-      </w:r>
-      <w:r>
-        <w:rPr>
-          <w:rFonts w:ascii="Consolas" w:hAnsi="Consolas" w:eastAsia="Malgun Gothic"/>
-          <w:color w:val="1F4D78"/>
-          <w:sz w:val="21"/>
-        </w:rPr>
-        <w:t>스크립트 속성</w:t>
-      </w:r>
-      <w:r>
-        <w:rPr>
-          <w:rFonts w:ascii="Calibri" w:hAnsi="Calibri" w:eastAsia="Malgun Gothic"/>
-          <w:color w:val="1F2937"/>
-          <w:sz w:val="21"/>
-        </w:rPr>
-        <w:t xml:space="preserve"> 또는 서비스별 비밀 저장소에서만 관리합니다.</w:t>
+        <w:t>비밀키는 GitHub에 기록하지 않고 서비스별 비밀 저장소에서만 관리합니다.</w:t>
       </w:r>
     </w:p>
     <w:p>
@@ -2368,23 +2237,7 @@
           <w:color w:val="1F2937"/>
           <w:sz w:val="21"/>
         </w:rPr>
-        <w:t xml:space="preserve">Apps Script의 </w:t>
-      </w:r>
-      <w:r>
-        <w:rPr>
-          <w:rFonts w:ascii="Consolas" w:hAnsi="Consolas" w:eastAsia="Malgun Gothic"/>
-          <w:color w:val="1F4D78"/>
-          <w:sz w:val="21"/>
-        </w:rPr>
-        <w:t>syncPaymentBuildings</w:t>
-      </w:r>
-      <w:r>
-        <w:rPr>
-          <w:rFonts w:ascii="Calibri" w:hAnsi="Calibri" w:eastAsia="Malgun Gothic"/>
-          <w:color w:val="1F2937"/>
-          <w:sz w:val="21"/>
-        </w:rPr>
-        <w:t xml:space="preserve">를 실행하거나 관리자 화면에서 </w:t>
+        <w:t xml:space="preserve">관리자 화면에서 </w:t>
       </w:r>
       <w:r>
         <w:rPr>
@@ -4953,23 +4806,7 @@
           <w:color w:val="1F2937"/>
           <w:sz w:val="21"/>
         </w:rPr>
-        <w:t xml:space="preserve">폼 제출 트리거 </w:t>
-      </w:r>
-      <w:r>
-        <w:rPr>
-          <w:rFonts w:ascii="Consolas" w:hAnsi="Consolas" w:eastAsia="Malgun Gothic"/>
-          <w:color w:val="1F4D78"/>
-          <w:sz w:val="21"/>
-        </w:rPr>
-        <w:t>onComplaintFormSubmit</w:t>
-      </w:r>
-      <w:r>
-        <w:rPr>
-          <w:rFonts w:ascii="Calibri" w:hAnsi="Calibri" w:eastAsia="Malgun Gothic"/>
-          <w:color w:val="1F2937"/>
-          <w:sz w:val="21"/>
-        </w:rPr>
-        <w:t>이 응답을 읽습니다.</w:t>
+        <w:t>자동화 시스템이 새 폼 응답을 읽습니다.</w:t>
       </w:r>
     </w:p>
     <w:p>
@@ -4982,7 +4819,7 @@
           <w:color w:val="1F2937"/>
           <w:sz w:val="21"/>
         </w:rPr>
-        <w:t>Apps Script가 온보딩 DOCX 본문을 검색해 계약 건물을 정합니다.</w:t>
+        <w:t>온보딩 DOCX 본문을 검색해 계약 건물을 정합니다.</w:t>
       </w:r>
     </w:p>
     <w:p>
@@ -6647,124 +6484,6 @@
                 <w:color w:val="1F4D78"/>
                 <w:sz w:val="17"/>
               </w:rPr>
-              <w:t>apps-script/complaint-intake-to-firebase.gs</w:t>
-            </w:r>
-          </w:p>
-        </w:tc>
-        <w:tc>
-          <w:tcPr>
-            <w:tcW w:type="dxa" w:w="6860"/>
-            <w:tcMar>
-              <w:top w:w="80" w:type="dxa"/>
-              <w:start w:w="120" w:type="dxa"/>
-              <w:bottom w:w="80" w:type="dxa"/>
-              <w:end w:w="120" w:type="dxa"/>
-            </w:tcMar>
-            <w:vAlign w:val="center"/>
-          </w:tcPr>
-          <w:p>
-            <w:pPr>
-              <w:spacing w:after="0" w:line="259" w:lineRule="auto"/>
-            </w:pPr>
-            <w:r/>
-            <w:r>
-              <w:rPr>
-                <w:rFonts w:ascii="Calibri" w:hAnsi="Calibri" w:eastAsia="Malgun Gothic"/>
-                <w:color w:val="1F2937"/>
-                <w:sz w:val="17"/>
-              </w:rPr>
-              <w:t>접수·문자·Drive·견적·승인·입금 자동화</w:t>
-            </w:r>
-          </w:p>
-        </w:tc>
-      </w:tr>
-      <w:tr>
-        <w:trPr>
-          <w:cantSplit/>
-        </w:trPr>
-        <w:tc>
-          <w:tcPr>
-            <w:tcW w:type="dxa" w:w="2500"/>
-            <w:shd w:fill="F8FAFC"/>
-            <w:tcMar>
-              <w:top w:w="80" w:type="dxa"/>
-              <w:start w:w="120" w:type="dxa"/>
-              <w:bottom w:w="80" w:type="dxa"/>
-              <w:end w:w="120" w:type="dxa"/>
-            </w:tcMar>
-            <w:vAlign w:val="center"/>
-          </w:tcPr>
-          <w:p>
-            <w:pPr>
-              <w:spacing w:after="0" w:line="259" w:lineRule="auto"/>
-              <w:jc w:val="center"/>
-            </w:pPr>
-            <w:r/>
-            <w:r>
-              <w:rPr>
-                <w:rFonts w:ascii="Consolas" w:hAnsi="Consolas" w:eastAsia="Malgun Gothic"/>
-                <w:color w:val="1F4D78"/>
-                <w:sz w:val="17"/>
-              </w:rPr>
-              <w:t>apps-script/appsscript.json</w:t>
-            </w:r>
-          </w:p>
-        </w:tc>
-        <w:tc>
-          <w:tcPr>
-            <w:tcW w:type="dxa" w:w="6860"/>
-            <w:shd w:fill="F8FAFC"/>
-            <w:tcMar>
-              <w:top w:w="80" w:type="dxa"/>
-              <w:start w:w="120" w:type="dxa"/>
-              <w:bottom w:w="80" w:type="dxa"/>
-              <w:end w:w="120" w:type="dxa"/>
-            </w:tcMar>
-            <w:vAlign w:val="center"/>
-          </w:tcPr>
-          <w:p>
-            <w:pPr>
-              <w:spacing w:after="0" w:line="259" w:lineRule="auto"/>
-            </w:pPr>
-            <w:r/>
-            <w:r>
-              <w:rPr>
-                <w:rFonts w:ascii="Calibri" w:hAnsi="Calibri" w:eastAsia="Malgun Gothic"/>
-                <w:color w:val="1F2937"/>
-                <w:sz w:val="17"/>
-              </w:rPr>
-              <w:t>Apps Script 권한·고급 서비스 설정</w:t>
-            </w:r>
-          </w:p>
-        </w:tc>
-      </w:tr>
-      <w:tr>
-        <w:trPr>
-          <w:cantSplit/>
-        </w:trPr>
-        <w:tc>
-          <w:tcPr>
-            <w:tcW w:type="dxa" w:w="2500"/>
-            <w:tcMar>
-              <w:top w:w="80" w:type="dxa"/>
-              <w:start w:w="120" w:type="dxa"/>
-              <w:bottom w:w="80" w:type="dxa"/>
-              <w:end w:w="120" w:type="dxa"/>
-            </w:tcMar>
-            <w:vAlign w:val="center"/>
-          </w:tcPr>
-          <w:p>
-            <w:pPr>
-              <w:spacing w:after="0" w:line="259" w:lineRule="auto"/>
-              <w:jc w:val="center"/>
-            </w:pPr>
-            <w:r/>
-            <w:r>
-              <w:rPr>
-                <w:rFonts w:ascii="Consolas" w:hAnsi="Consolas" w:eastAsia="Malgun Gothic"/>
-                <w:color w:val="1F4D78"/>
-                <w:sz w:val="17"/>
-              </w:rPr>
               <w:t>database.rules.json</w:t>
             </w:r>
           </w:p>
@@ -6796,66 +6515,6 @@
           </w:p>
         </w:tc>
       </w:tr>
-      <w:tr>
-        <w:trPr>
-          <w:cantSplit/>
-        </w:trPr>
-        <w:tc>
-          <w:tcPr>
-            <w:tcW w:type="dxa" w:w="2500"/>
-            <w:shd w:fill="F8FAFC"/>
-            <w:tcMar>
-              <w:top w:w="80" w:type="dxa"/>
-              <w:start w:w="120" w:type="dxa"/>
-              <w:bottom w:w="80" w:type="dxa"/>
-              <w:end w:w="120" w:type="dxa"/>
-            </w:tcMar>
-            <w:vAlign w:val="center"/>
-          </w:tcPr>
-          <w:p>
-            <w:pPr>
-              <w:spacing w:after="0" w:line="259" w:lineRule="auto"/>
-              <w:jc w:val="center"/>
-            </w:pPr>
-            <w:r/>
-            <w:r>
-              <w:rPr>
-                <w:rFonts w:ascii="Consolas" w:hAnsi="Consolas" w:eastAsia="Malgun Gothic"/>
-                <w:color w:val="1F4D78"/>
-                <w:sz w:val="17"/>
-              </w:rPr>
-              <w:t>apps-script/README.md</w:t>
-            </w:r>
-          </w:p>
-        </w:tc>
-        <w:tc>
-          <w:tcPr>
-            <w:tcW w:type="dxa" w:w="6860"/>
-            <w:shd w:fill="F8FAFC"/>
-            <w:tcMar>
-              <w:top w:w="80" w:type="dxa"/>
-              <w:start w:w="120" w:type="dxa"/>
-              <w:bottom w:w="80" w:type="dxa"/>
-              <w:end w:w="120" w:type="dxa"/>
-            </w:tcMar>
-            <w:vAlign w:val="center"/>
-          </w:tcPr>
-          <w:p>
-            <w:pPr>
-              <w:spacing w:after="0" w:line="259" w:lineRule="auto"/>
-            </w:pPr>
-            <w:r/>
-            <w:r>
-              <w:rPr>
-                <w:rFonts w:ascii="Calibri" w:hAnsi="Calibri" w:eastAsia="Malgun Gothic"/>
-                <w:color w:val="1F2937"/>
-                <w:sz w:val="17"/>
-              </w:rPr>
-              <w:t>Apps Script 상세 설치·테스트 절차</w:t>
-            </w:r>
-          </w:p>
-        </w:tc>
-      </w:tr>
     </w:tbl>
     <w:p>
       <w:pPr>
@@ -6872,1353 +6531,7 @@
           <w:color w:val="2E74B5"/>
           <w:sz w:val="32"/>
         </w:rPr>
-        <w:t>10. Apps Script 운영과 배포</w:t>
-      </w:r>
-    </w:p>
-    <w:p>
-      <w:pPr>
-        <w:pStyle w:val="Heading2"/>
-      </w:pPr>
-      <w:r>
-        <w:rPr>
-          <w:rFonts w:ascii="Calibri" w:hAnsi="Calibri" w:eastAsia="Malgun Gothic"/>
-          <w:color w:val="2E74B5"/>
-          <w:sz w:val="26"/>
-        </w:rPr>
-        <w:t>10.1 코드 변경 후 반영</w:t>
-      </w:r>
-    </w:p>
-    <w:p>
-      <w:pPr>
-        <w:pStyle w:val="ListNumber"/>
-      </w:pPr>
-      <w:r>
-        <w:rPr>
-          <w:rFonts w:ascii="Calibri" w:hAnsi="Calibri" w:eastAsia="Malgun Gothic"/>
-          <w:color w:val="1F2937"/>
-          <w:sz w:val="21"/>
-        </w:rPr>
-        <w:t xml:space="preserve">로컬 </w:t>
-      </w:r>
-      <w:r>
-        <w:rPr>
-          <w:rFonts w:ascii="Consolas" w:hAnsi="Consolas" w:eastAsia="Malgun Gothic"/>
-          <w:color w:val="1F4D78"/>
-          <w:sz w:val="21"/>
-        </w:rPr>
-        <w:t>apps-script/complaint-intake-to-firebase.gs</w:t>
-      </w:r>
-      <w:r>
-        <w:rPr>
-          <w:rFonts w:ascii="Calibri" w:hAnsi="Calibri" w:eastAsia="Malgun Gothic"/>
-          <w:color w:val="1F2937"/>
-          <w:sz w:val="21"/>
-        </w:rPr>
-        <w:t>의 최신 코드를 확인합니다.</w:t>
-      </w:r>
-    </w:p>
-    <w:p>
-      <w:pPr>
-        <w:pStyle w:val="ListNumber"/>
-      </w:pPr>
-      <w:r>
-        <w:rPr>
-          <w:rFonts w:ascii="Calibri" w:hAnsi="Calibri" w:eastAsia="Malgun Gothic"/>
-          <w:color w:val="1F2937"/>
-          <w:sz w:val="21"/>
-        </w:rPr>
-        <w:t xml:space="preserve">Google 응답 시트에서 </w:t>
-      </w:r>
-      <w:r>
-        <w:rPr>
-          <w:rFonts w:ascii="Consolas" w:hAnsi="Consolas" w:eastAsia="Malgun Gothic"/>
-          <w:color w:val="1F4D78"/>
-          <w:sz w:val="21"/>
-        </w:rPr>
-        <w:t>확장 프로그램 → Apps Script</w:t>
-      </w:r>
-      <w:r>
-        <w:rPr>
-          <w:rFonts w:ascii="Calibri" w:hAnsi="Calibri" w:eastAsia="Malgun Gothic"/>
-          <w:color w:val="1F2937"/>
-          <w:sz w:val="21"/>
-        </w:rPr>
-        <w:t>를 엽니다.</w:t>
-      </w:r>
-    </w:p>
-    <w:p>
-      <w:pPr>
-        <w:pStyle w:val="ListNumber"/>
-      </w:pPr>
-      <w:r>
-        <w:rPr>
-          <w:rFonts w:ascii="Consolas" w:hAnsi="Consolas" w:eastAsia="Malgun Gothic"/>
-          <w:color w:val="1F4D78"/>
-          <w:sz w:val="21"/>
-        </w:rPr>
-        <w:t>Code.gs</w:t>
-      </w:r>
-      <w:r>
-        <w:rPr>
-          <w:rFonts w:ascii="Calibri" w:hAnsi="Calibri" w:eastAsia="Malgun Gothic"/>
-          <w:color w:val="1F2937"/>
-          <w:sz w:val="21"/>
-        </w:rPr>
-        <w:t xml:space="preserve"> 전체를 최신 코드로 교체하고 저장합니다.</w:t>
-      </w:r>
-    </w:p>
-    <w:p>
-      <w:pPr>
-        <w:pStyle w:val="ListNumber"/>
-      </w:pPr>
-      <w:r>
-        <w:rPr>
-          <w:rFonts w:ascii="Consolas" w:hAnsi="Consolas" w:eastAsia="Malgun Gothic"/>
-          <w:color w:val="1F4D78"/>
-          <w:sz w:val="21"/>
-        </w:rPr>
-        <w:t>appsscript.json</w:t>
-      </w:r>
-      <w:r>
-        <w:rPr>
-          <w:rFonts w:ascii="Calibri" w:hAnsi="Calibri" w:eastAsia="Malgun Gothic"/>
-          <w:color w:val="1F2937"/>
-          <w:sz w:val="21"/>
-        </w:rPr>
-        <w:t xml:space="preserve"> 변경이 있으면 매니페스트도 교체합니다.</w:t>
-      </w:r>
-    </w:p>
-    <w:p>
-      <w:pPr>
-        <w:pStyle w:val="ListNumber"/>
-      </w:pPr>
-      <w:r>
-        <w:rPr>
-          <w:rFonts w:ascii="Calibri" w:hAnsi="Calibri" w:eastAsia="Malgun Gothic"/>
-          <w:color w:val="1F2937"/>
-          <w:sz w:val="21"/>
-        </w:rPr>
-        <w:t xml:space="preserve">새 권한이 추가됐다면 </w:t>
-      </w:r>
-      <w:r>
-        <w:rPr>
-          <w:rFonts w:ascii="Consolas" w:hAnsi="Consolas" w:eastAsia="Malgun Gothic"/>
-          <w:color w:val="1F4D78"/>
-          <w:sz w:val="21"/>
-        </w:rPr>
-        <w:t>authorizeDriveAccess</w:t>
-      </w:r>
-      <w:r>
-        <w:rPr>
-          <w:rFonts w:ascii="Calibri" w:hAnsi="Calibri" w:eastAsia="Malgun Gothic"/>
-          <w:color w:val="1F2937"/>
-          <w:sz w:val="21"/>
-        </w:rPr>
-        <w:t xml:space="preserve"> 또는 관련 설정 함수를 실행해 승인합니다.</w:t>
-      </w:r>
-    </w:p>
-    <w:p>
-      <w:pPr>
-        <w:pStyle w:val="ListNumber"/>
-      </w:pPr>
-      <w:r>
-        <w:rPr>
-          <w:rFonts w:ascii="Consolas" w:hAnsi="Consolas" w:eastAsia="Malgun Gothic"/>
-          <w:color w:val="1F4D78"/>
-          <w:sz w:val="21"/>
-        </w:rPr>
-        <w:t>배포 → 배포 관리 → 편집 → 새 버전 → 배포</w:t>
-      </w:r>
-      <w:r>
-        <w:rPr>
-          <w:rFonts w:ascii="Calibri" w:hAnsi="Calibri" w:eastAsia="Malgun Gothic"/>
-          <w:color w:val="1F2937"/>
-          <w:sz w:val="21"/>
-        </w:rPr>
-        <w:t>를 실행합니다.</w:t>
-      </w:r>
-    </w:p>
-    <w:p>
-      <w:pPr>
-        <w:pStyle w:val="ListNumber"/>
-      </w:pPr>
-      <w:r>
-        <w:rPr>
-          <w:rFonts w:ascii="Calibri" w:hAnsi="Calibri" w:eastAsia="Malgun Gothic"/>
-          <w:color w:val="1F2937"/>
-          <w:sz w:val="21"/>
-        </w:rPr>
-        <w:t>웹 앱 URL이 바뀌지 않았는지 확인합니다.</w:t>
-      </w:r>
-    </w:p>
-    <w:p>
-      <w:pPr>
-        <w:pStyle w:val="ListNumber"/>
-      </w:pPr>
-      <w:r>
-        <w:rPr>
-          <w:rFonts w:ascii="Calibri" w:hAnsi="Calibri" w:eastAsia="Malgun Gothic"/>
-          <w:color w:val="1F2937"/>
-          <w:sz w:val="21"/>
-        </w:rPr>
-        <w:t xml:space="preserve">웹 앱 주소에 </w:t>
-      </w:r>
-      <w:r>
-        <w:rPr>
-          <w:rFonts w:ascii="Consolas" w:hAnsi="Consolas" w:eastAsia="Malgun Gothic"/>
-          <w:color w:val="1F4D78"/>
-          <w:sz w:val="21"/>
-        </w:rPr>
-        <w:t>?action=health</w:t>
-      </w:r>
-      <w:r>
-        <w:rPr>
-          <w:rFonts w:ascii="Calibri" w:hAnsi="Calibri" w:eastAsia="Malgun Gothic"/>
-          <w:color w:val="1F2937"/>
-          <w:sz w:val="21"/>
-        </w:rPr>
-        <w:t xml:space="preserve"> 또는 시스템의 상태 확인 요청을 보내 현재 빌드를 확인합니다.</w:t>
-      </w:r>
-    </w:p>
-    <w:p>
-      <w:pPr>
-        <w:pStyle w:val="ListNumber"/>
-      </w:pPr>
-      <w:r>
-        <w:rPr>
-          <w:rFonts w:ascii="Calibri" w:hAnsi="Calibri" w:eastAsia="Malgun Gothic"/>
-          <w:color w:val="1F2937"/>
-          <w:sz w:val="21"/>
-        </w:rPr>
-        <w:t>실제 테스트 케이스 1건으로 문자·파일 업로드·상태 전환을 확인합니다.</w:t>
-      </w:r>
-    </w:p>
-    <w:p>
-      <w:pPr>
-        <w:pStyle w:val="Heading2"/>
-      </w:pPr>
-      <w:r>
-        <w:rPr>
-          <w:rFonts w:ascii="Calibri" w:hAnsi="Calibri" w:eastAsia="Malgun Gothic"/>
-          <w:color w:val="2E74B5"/>
-          <w:sz w:val="26"/>
-        </w:rPr>
-        <w:t>10.2 주요 스크립트 속성</w:t>
-      </w:r>
-    </w:p>
-    <w:tbl>
-      <w:tblPr>
-        <w:tblStyle w:val="TableGrid"/>
-        <w:tblW w:type="dxa" w:w="9360"/>
-        <w:jc w:val="left"/>
-        <w:tblLayout w:type="fixed"/>
-        <w:tblLook w:firstColumn="1" w:firstRow="1" w:lastColumn="0" w:lastRow="0" w:noHBand="0" w:noVBand="1" w:val="04A0"/>
-        <w:tblInd w:w="120" w:type="dxa"/>
-      </w:tblPr>
-      <w:tblGrid>
-        <w:gridCol w:w="1700"/>
-        <w:gridCol w:w="3700"/>
-        <w:gridCol w:w="3960"/>
-      </w:tblGrid>
-      <w:tr>
-        <w:trPr>
-          <w:tblHeader w:val="true"/>
-          <w:cantSplit/>
-        </w:trPr>
-        <w:tc>
-          <w:tcPr>
-            <w:tcW w:type="dxa" w:w="1700"/>
-            <w:shd w:fill="E8EEF5"/>
-            <w:tcMar>
-              <w:top w:w="80" w:type="dxa"/>
-              <w:start w:w="120" w:type="dxa"/>
-              <w:bottom w:w="80" w:type="dxa"/>
-              <w:end w:w="120" w:type="dxa"/>
-            </w:tcMar>
-            <w:vAlign w:val="center"/>
-          </w:tcPr>
-          <w:p>
-            <w:pPr>
-              <w:spacing w:after="0" w:line="259" w:lineRule="auto"/>
-              <w:jc w:val="center"/>
-            </w:pPr>
-            <w:r>
-              <w:rPr>
-                <w:b/>
-                <w:color w:val="17365D"/>
-              </w:rPr>
-            </w:r>
-            <w:r>
-              <w:rPr>
-                <w:rFonts w:ascii="Calibri" w:hAnsi="Calibri" w:eastAsia="Malgun Gothic"/>
-                <w:b/>
-                <w:color w:val="17365D"/>
-                <w:sz w:val="17"/>
-              </w:rPr>
-              <w:t>영역</w:t>
-            </w:r>
-          </w:p>
-        </w:tc>
-        <w:tc>
-          <w:tcPr>
-            <w:tcW w:type="dxa" w:w="3700"/>
-            <w:shd w:fill="E8EEF5"/>
-            <w:tcMar>
-              <w:top w:w="80" w:type="dxa"/>
-              <w:start w:w="120" w:type="dxa"/>
-              <w:bottom w:w="80" w:type="dxa"/>
-              <w:end w:w="120" w:type="dxa"/>
-            </w:tcMar>
-            <w:vAlign w:val="center"/>
-          </w:tcPr>
-          <w:p>
-            <w:pPr>
-              <w:spacing w:after="0" w:line="259" w:lineRule="auto"/>
-              <w:jc w:val="center"/>
-            </w:pPr>
-            <w:r>
-              <w:rPr>
-                <w:b/>
-                <w:color w:val="17365D"/>
-              </w:rPr>
-            </w:r>
-            <w:r>
-              <w:rPr>
-                <w:rFonts w:ascii="Calibri" w:hAnsi="Calibri" w:eastAsia="Malgun Gothic"/>
-                <w:b/>
-                <w:color w:val="17365D"/>
-                <w:sz w:val="17"/>
-              </w:rPr>
-              <w:t>속성 이름</w:t>
-            </w:r>
-          </w:p>
-        </w:tc>
-        <w:tc>
-          <w:tcPr>
-            <w:tcW w:type="dxa" w:w="3960"/>
-            <w:shd w:fill="E8EEF5"/>
-            <w:tcMar>
-              <w:top w:w="80" w:type="dxa"/>
-              <w:start w:w="120" w:type="dxa"/>
-              <w:bottom w:w="80" w:type="dxa"/>
-              <w:end w:w="120" w:type="dxa"/>
-            </w:tcMar>
-            <w:vAlign w:val="center"/>
-          </w:tcPr>
-          <w:p>
-            <w:pPr>
-              <w:spacing w:after="0" w:line="259" w:lineRule="auto"/>
-              <w:jc w:val="center"/>
-            </w:pPr>
-            <w:r>
-              <w:rPr>
-                <w:b/>
-                <w:color w:val="17365D"/>
-              </w:rPr>
-            </w:r>
-            <w:r>
-              <w:rPr>
-                <w:rFonts w:ascii="Calibri" w:hAnsi="Calibri" w:eastAsia="Malgun Gothic"/>
-                <w:b/>
-                <w:color w:val="17365D"/>
-                <w:sz w:val="17"/>
-              </w:rPr>
-              <w:t>주의</w:t>
-            </w:r>
-          </w:p>
-        </w:tc>
-      </w:tr>
-      <w:tr>
-        <w:trPr>
-          <w:cantSplit/>
-        </w:trPr>
-        <w:tc>
-          <w:tcPr>
-            <w:tcW w:type="dxa" w:w="1700"/>
-            <w:tcMar>
-              <w:top w:w="80" w:type="dxa"/>
-              <w:start w:w="120" w:type="dxa"/>
-              <w:bottom w:w="80" w:type="dxa"/>
-              <w:end w:w="120" w:type="dxa"/>
-            </w:tcMar>
-            <w:vAlign w:val="center"/>
-          </w:tcPr>
-          <w:p>
-            <w:pPr>
-              <w:spacing w:after="0" w:line="259" w:lineRule="auto"/>
-              <w:jc w:val="center"/>
-            </w:pPr>
-            <w:r/>
-            <w:r>
-              <w:rPr>
-                <w:rFonts w:ascii="Calibri" w:hAnsi="Calibri" w:eastAsia="Malgun Gothic"/>
-                <w:color w:val="1F2937"/>
-                <w:sz w:val="17"/>
-              </w:rPr>
-              <w:t>SENS</w:t>
-            </w:r>
-          </w:p>
-        </w:tc>
-        <w:tc>
-          <w:tcPr>
-            <w:tcW w:type="dxa" w:w="3700"/>
-            <w:tcMar>
-              <w:top w:w="80" w:type="dxa"/>
-              <w:start w:w="120" w:type="dxa"/>
-              <w:bottom w:w="80" w:type="dxa"/>
-              <w:end w:w="120" w:type="dxa"/>
-            </w:tcMar>
-            <w:vAlign w:val="center"/>
-          </w:tcPr>
-          <w:p>
-            <w:pPr>
-              <w:spacing w:after="0" w:line="259" w:lineRule="auto"/>
-            </w:pPr>
-            <w:r/>
-            <w:r>
-              <w:rPr>
-                <w:rFonts w:ascii="Consolas" w:hAnsi="Consolas" w:eastAsia="Malgun Gothic"/>
-                <w:color w:val="1F4D78"/>
-                <w:sz w:val="17"/>
-              </w:rPr>
-              <w:t>NCP_SENS_SERVICE_ID</w:t>
-            </w:r>
-            <w:r>
-              <w:rPr>
-                <w:rFonts w:ascii="Calibri" w:hAnsi="Calibri" w:eastAsia="Malgun Gothic"/>
-                <w:color w:val="1F2937"/>
-                <w:sz w:val="17"/>
-              </w:rPr>
-              <w:t xml:space="preserve">, </w:t>
-            </w:r>
-            <w:r>
-              <w:rPr>
-                <w:rFonts w:ascii="Consolas" w:hAnsi="Consolas" w:eastAsia="Malgun Gothic"/>
-                <w:color w:val="1F4D78"/>
-                <w:sz w:val="17"/>
-              </w:rPr>
-              <w:t>NCP_ACCESS_KEY</w:t>
-            </w:r>
-            <w:r>
-              <w:rPr>
-                <w:rFonts w:ascii="Calibri" w:hAnsi="Calibri" w:eastAsia="Malgun Gothic"/>
-                <w:color w:val="1F2937"/>
-                <w:sz w:val="17"/>
-              </w:rPr>
-              <w:t xml:space="preserve">, </w:t>
-            </w:r>
-            <w:r>
-              <w:rPr>
-                <w:rFonts w:ascii="Consolas" w:hAnsi="Consolas" w:eastAsia="Malgun Gothic"/>
-                <w:color w:val="1F4D78"/>
-                <w:sz w:val="17"/>
-              </w:rPr>
-              <w:t>NCP_SECRET_KEY</w:t>
-            </w:r>
-            <w:r>
-              <w:rPr>
-                <w:rFonts w:ascii="Calibri" w:hAnsi="Calibri" w:eastAsia="Malgun Gothic"/>
-                <w:color w:val="1F2937"/>
-                <w:sz w:val="17"/>
-              </w:rPr>
-              <w:t xml:space="preserve">, </w:t>
-            </w:r>
-            <w:r>
-              <w:rPr>
-                <w:rFonts w:ascii="Consolas" w:hAnsi="Consolas" w:eastAsia="Malgun Gothic"/>
-                <w:color w:val="1F4D78"/>
-                <w:sz w:val="17"/>
-              </w:rPr>
-              <w:t>NCP_SENS_FROM</w:t>
-            </w:r>
-            <w:r>
-              <w:rPr>
-                <w:rFonts w:ascii="Calibri" w:hAnsi="Calibri" w:eastAsia="Malgun Gothic"/>
-                <w:color w:val="1F2937"/>
-                <w:sz w:val="17"/>
-              </w:rPr>
-              <w:t xml:space="preserve">, </w:t>
-            </w:r>
-            <w:r>
-              <w:rPr>
-                <w:rFonts w:ascii="Consolas" w:hAnsi="Consolas" w:eastAsia="Malgun Gothic"/>
-                <w:color w:val="1F4D78"/>
-                <w:sz w:val="17"/>
-              </w:rPr>
-              <w:t>SMS_ENABLED</w:t>
-            </w:r>
-          </w:p>
-        </w:tc>
-        <w:tc>
-          <w:tcPr>
-            <w:tcW w:type="dxa" w:w="3960"/>
-            <w:tcMar>
-              <w:top w:w="80" w:type="dxa"/>
-              <w:start w:w="120" w:type="dxa"/>
-              <w:bottom w:w="80" w:type="dxa"/>
-              <w:end w:w="120" w:type="dxa"/>
-            </w:tcMar>
-            <w:vAlign w:val="center"/>
-          </w:tcPr>
-          <w:p>
-            <w:pPr>
-              <w:spacing w:after="0" w:line="259" w:lineRule="auto"/>
-            </w:pPr>
-            <w:r/>
-            <w:r>
-              <w:rPr>
-                <w:rFonts w:ascii="Calibri" w:hAnsi="Calibri" w:eastAsia="Malgun Gothic"/>
-                <w:color w:val="1F2937"/>
-                <w:sz w:val="17"/>
-              </w:rPr>
-              <w:t>발신번호는 반드시 승인된 번호</w:t>
-            </w:r>
-          </w:p>
-        </w:tc>
-      </w:tr>
-      <w:tr>
-        <w:trPr>
-          <w:cantSplit/>
-        </w:trPr>
-        <w:tc>
-          <w:tcPr>
-            <w:tcW w:type="dxa" w:w="1700"/>
-            <w:shd w:fill="F8FAFC"/>
-            <w:tcMar>
-              <w:top w:w="80" w:type="dxa"/>
-              <w:start w:w="120" w:type="dxa"/>
-              <w:bottom w:w="80" w:type="dxa"/>
-              <w:end w:w="120" w:type="dxa"/>
-            </w:tcMar>
-            <w:vAlign w:val="center"/>
-          </w:tcPr>
-          <w:p>
-            <w:pPr>
-              <w:spacing w:after="0" w:line="259" w:lineRule="auto"/>
-              <w:jc w:val="center"/>
-            </w:pPr>
-            <w:r/>
-            <w:r>
-              <w:rPr>
-                <w:rFonts w:ascii="Calibri" w:hAnsi="Calibri" w:eastAsia="Malgun Gothic"/>
-                <w:color w:val="1F2937"/>
-                <w:sz w:val="17"/>
-              </w:rPr>
-              <w:t>테스트</w:t>
-            </w:r>
-          </w:p>
-        </w:tc>
-        <w:tc>
-          <w:tcPr>
-            <w:tcW w:type="dxa" w:w="3700"/>
-            <w:shd w:fill="F8FAFC"/>
-            <w:tcMar>
-              <w:top w:w="80" w:type="dxa"/>
-              <w:start w:w="120" w:type="dxa"/>
-              <w:bottom w:w="80" w:type="dxa"/>
-              <w:end w:w="120" w:type="dxa"/>
-            </w:tcMar>
-            <w:vAlign w:val="center"/>
-          </w:tcPr>
-          <w:p>
-            <w:pPr>
-              <w:spacing w:after="0" w:line="259" w:lineRule="auto"/>
-            </w:pPr>
-            <w:r/>
-            <w:r>
-              <w:rPr>
-                <w:rFonts w:ascii="Consolas" w:hAnsi="Consolas" w:eastAsia="Malgun Gothic"/>
-                <w:color w:val="1F4D78"/>
-                <w:sz w:val="17"/>
-              </w:rPr>
-              <w:t>NCP_SENS_TEST_TO</w:t>
-            </w:r>
-          </w:p>
-        </w:tc>
-        <w:tc>
-          <w:tcPr>
-            <w:tcW w:type="dxa" w:w="3960"/>
-            <w:shd w:fill="F8FAFC"/>
-            <w:tcMar>
-              <w:top w:w="80" w:type="dxa"/>
-              <w:start w:w="120" w:type="dxa"/>
-              <w:bottom w:w="80" w:type="dxa"/>
-              <w:end w:w="120" w:type="dxa"/>
-            </w:tcMar>
-            <w:vAlign w:val="center"/>
-          </w:tcPr>
-          <w:p>
-            <w:pPr>
-              <w:spacing w:after="0" w:line="259" w:lineRule="auto"/>
-            </w:pPr>
-            <w:r/>
-            <w:r>
-              <w:rPr>
-                <w:rFonts w:ascii="Calibri" w:hAnsi="Calibri" w:eastAsia="Malgun Gothic"/>
-                <w:color w:val="1F2937"/>
-                <w:sz w:val="17"/>
-              </w:rPr>
-              <w:t>운영 수신자와 분리</w:t>
-            </w:r>
-          </w:p>
-        </w:tc>
-      </w:tr>
-      <w:tr>
-        <w:trPr>
-          <w:cantSplit/>
-        </w:trPr>
-        <w:tc>
-          <w:tcPr>
-            <w:tcW w:type="dxa" w:w="1700"/>
-            <w:tcMar>
-              <w:top w:w="80" w:type="dxa"/>
-              <w:start w:w="120" w:type="dxa"/>
-              <w:bottom w:w="80" w:type="dxa"/>
-              <w:end w:w="120" w:type="dxa"/>
-            </w:tcMar>
-            <w:vAlign w:val="center"/>
-          </w:tcPr>
-          <w:p>
-            <w:pPr>
-              <w:spacing w:after="0" w:line="259" w:lineRule="auto"/>
-              <w:jc w:val="center"/>
-            </w:pPr>
-            <w:r/>
-            <w:r>
-              <w:rPr>
-                <w:rFonts w:ascii="Calibri" w:hAnsi="Calibri" w:eastAsia="Malgun Gothic"/>
-                <w:color w:val="1F2937"/>
-                <w:sz w:val="17"/>
-              </w:rPr>
-              <w:t>견적 회신</w:t>
-            </w:r>
-          </w:p>
-        </w:tc>
-        <w:tc>
-          <w:tcPr>
-            <w:tcW w:type="dxa" w:w="3700"/>
-            <w:tcMar>
-              <w:top w:w="80" w:type="dxa"/>
-              <w:start w:w="120" w:type="dxa"/>
-              <w:bottom w:w="80" w:type="dxa"/>
-              <w:end w:w="120" w:type="dxa"/>
-            </w:tcMar>
-            <w:vAlign w:val="center"/>
-          </w:tcPr>
-          <w:p>
-            <w:pPr>
-              <w:spacing w:after="0" w:line="259" w:lineRule="auto"/>
-            </w:pPr>
-            <w:r/>
-            <w:r>
-              <w:rPr>
-                <w:rFonts w:ascii="Consolas" w:hAnsi="Consolas" w:eastAsia="Malgun Gothic"/>
-                <w:color w:val="1F4D78"/>
-                <w:sz w:val="17"/>
-              </w:rPr>
-              <w:t>VENDOR_QUOTE_REPLY_EMAIL</w:t>
-            </w:r>
-          </w:p>
-        </w:tc>
-        <w:tc>
-          <w:tcPr>
-            <w:tcW w:type="dxa" w:w="3960"/>
-            <w:tcMar>
-              <w:top w:w="80" w:type="dxa"/>
-              <w:start w:w="120" w:type="dxa"/>
-              <w:bottom w:w="80" w:type="dxa"/>
-              <w:end w:w="120" w:type="dxa"/>
-            </w:tcMar>
-            <w:vAlign w:val="center"/>
-          </w:tcPr>
-          <w:p>
-            <w:pPr>
-              <w:spacing w:after="0" w:line="259" w:lineRule="auto"/>
-            </w:pPr>
-            <w:r/>
-            <w:r>
-              <w:rPr>
-                <w:rFonts w:ascii="Calibri" w:hAnsi="Calibri" w:eastAsia="Malgun Gothic"/>
-                <w:color w:val="1F2937"/>
-                <w:sz w:val="17"/>
-              </w:rPr>
-              <w:t>기본 운영 메일 확인</w:t>
-            </w:r>
-          </w:p>
-        </w:tc>
-      </w:tr>
-      <w:tr>
-        <w:trPr>
-          <w:cantSplit/>
-        </w:trPr>
-        <w:tc>
-          <w:tcPr>
-            <w:tcW w:type="dxa" w:w="1700"/>
-            <w:shd w:fill="F8FAFC"/>
-            <w:tcMar>
-              <w:top w:w="80" w:type="dxa"/>
-              <w:start w:w="120" w:type="dxa"/>
-              <w:bottom w:w="80" w:type="dxa"/>
-              <w:end w:w="120" w:type="dxa"/>
-            </w:tcMar>
-            <w:vAlign w:val="center"/>
-          </w:tcPr>
-          <w:p>
-            <w:pPr>
-              <w:spacing w:after="0" w:line="259" w:lineRule="auto"/>
-              <w:jc w:val="center"/>
-            </w:pPr>
-            <w:r/>
-            <w:r>
-              <w:rPr>
-                <w:rFonts w:ascii="Calibri" w:hAnsi="Calibri" w:eastAsia="Malgun Gothic"/>
-                <w:color w:val="1F2937"/>
-                <w:sz w:val="17"/>
-              </w:rPr>
-              <w:t>MinerU</w:t>
-            </w:r>
-          </w:p>
-        </w:tc>
-        <w:tc>
-          <w:tcPr>
-            <w:tcW w:type="dxa" w:w="3700"/>
-            <w:shd w:fill="F8FAFC"/>
-            <w:tcMar>
-              <w:top w:w="80" w:type="dxa"/>
-              <w:start w:w="120" w:type="dxa"/>
-              <w:bottom w:w="80" w:type="dxa"/>
-              <w:end w:w="120" w:type="dxa"/>
-            </w:tcMar>
-            <w:vAlign w:val="center"/>
-          </w:tcPr>
-          <w:p>
-            <w:pPr>
-              <w:spacing w:after="0" w:line="259" w:lineRule="auto"/>
-            </w:pPr>
-            <w:r/>
-            <w:r>
-              <w:rPr>
-                <w:rFonts w:ascii="Consolas" w:hAnsi="Consolas" w:eastAsia="Malgun Gothic"/>
-                <w:color w:val="1F4D78"/>
-                <w:sz w:val="17"/>
-              </w:rPr>
-              <w:t>MINERU_API_KEY</w:t>
-            </w:r>
-            <w:r>
-              <w:rPr>
-                <w:rFonts w:ascii="Calibri" w:hAnsi="Calibri" w:eastAsia="Malgun Gothic"/>
-                <w:color w:val="1F2937"/>
-                <w:sz w:val="17"/>
-              </w:rPr>
-              <w:t xml:space="preserve">, </w:t>
-            </w:r>
-            <w:r>
-              <w:rPr>
-                <w:rFonts w:ascii="Consolas" w:hAnsi="Consolas" w:eastAsia="Malgun Gothic"/>
-                <w:color w:val="1F4D78"/>
-                <w:sz w:val="17"/>
-              </w:rPr>
-              <w:t>MINERU_API_URL</w:t>
-            </w:r>
-            <w:r>
-              <w:rPr>
-                <w:rFonts w:ascii="Calibri" w:hAnsi="Calibri" w:eastAsia="Malgun Gothic"/>
-                <w:color w:val="1F2937"/>
-                <w:sz w:val="17"/>
-              </w:rPr>
-              <w:t xml:space="preserve">, </w:t>
-            </w:r>
-            <w:r>
-              <w:rPr>
-                <w:rFonts w:ascii="Consolas" w:hAnsi="Consolas" w:eastAsia="Malgun Gothic"/>
-                <w:color w:val="1F4D78"/>
-                <w:sz w:val="17"/>
-              </w:rPr>
-              <w:t>MINERU_SYNC_ENABLED</w:t>
-            </w:r>
-            <w:r>
-              <w:rPr>
-                <w:rFonts w:ascii="Calibri" w:hAnsi="Calibri" w:eastAsia="Malgun Gothic"/>
-                <w:color w:val="1F2937"/>
-                <w:sz w:val="17"/>
-              </w:rPr>
-              <w:t xml:space="preserve">, </w:t>
-            </w:r>
-            <w:r>
-              <w:rPr>
-                <w:rFonts w:ascii="Consolas" w:hAnsi="Consolas" w:eastAsia="Malgun Gothic"/>
-                <w:color w:val="1F4D78"/>
-                <w:sz w:val="17"/>
-              </w:rPr>
-              <w:t>MINERU_MAX_WAIT_SECONDS</w:t>
-            </w:r>
-          </w:p>
-        </w:tc>
-        <w:tc>
-          <w:tcPr>
-            <w:tcW w:type="dxa" w:w="3960"/>
-            <w:shd w:fill="F8FAFC"/>
-            <w:tcMar>
-              <w:top w:w="80" w:type="dxa"/>
-              <w:start w:w="120" w:type="dxa"/>
-              <w:bottom w:w="80" w:type="dxa"/>
-              <w:end w:w="120" w:type="dxa"/>
-            </w:tcMar>
-            <w:vAlign w:val="center"/>
-          </w:tcPr>
-          <w:p>
-            <w:pPr>
-              <w:spacing w:after="0" w:line="259" w:lineRule="auto"/>
-            </w:pPr>
-            <w:r/>
-            <w:r>
-              <w:rPr>
-                <w:rFonts w:ascii="Calibri" w:hAnsi="Calibri" w:eastAsia="Malgun Gothic"/>
-                <w:color w:val="1F2937"/>
-                <w:sz w:val="17"/>
-              </w:rPr>
-              <w:t>실시간 대기는 업로드를 느리게 할 수 있음</w:t>
-            </w:r>
-          </w:p>
-        </w:tc>
-      </w:tr>
-      <w:tr>
-        <w:trPr>
-          <w:cantSplit/>
-        </w:trPr>
-        <w:tc>
-          <w:tcPr>
-            <w:tcW w:type="dxa" w:w="1700"/>
-            <w:tcMar>
-              <w:top w:w="80" w:type="dxa"/>
-              <w:start w:w="120" w:type="dxa"/>
-              <w:bottom w:w="80" w:type="dxa"/>
-              <w:end w:w="120" w:type="dxa"/>
-            </w:tcMar>
-            <w:vAlign w:val="center"/>
-          </w:tcPr>
-          <w:p>
-            <w:pPr>
-              <w:spacing w:after="0" w:line="259" w:lineRule="auto"/>
-              <w:jc w:val="center"/>
-            </w:pPr>
-            <w:r/>
-            <w:r>
-              <w:rPr>
-                <w:rFonts w:ascii="Calibri" w:hAnsi="Calibri" w:eastAsia="Malgun Gothic"/>
-                <w:color w:val="1F2937"/>
-                <w:sz w:val="17"/>
-              </w:rPr>
-              <w:t>카카오 알림톡</w:t>
-            </w:r>
-          </w:p>
-        </w:tc>
-        <w:tc>
-          <w:tcPr>
-            <w:tcW w:type="dxa" w:w="3700"/>
-            <w:tcMar>
-              <w:top w:w="80" w:type="dxa"/>
-              <w:start w:w="120" w:type="dxa"/>
-              <w:bottom w:w="80" w:type="dxa"/>
-              <w:end w:w="120" w:type="dxa"/>
-            </w:tcMar>
-            <w:vAlign w:val="center"/>
-          </w:tcPr>
-          <w:p>
-            <w:pPr>
-              <w:spacing w:after="0" w:line="259" w:lineRule="auto"/>
-            </w:pPr>
-            <w:r/>
-            <w:r>
-              <w:rPr>
-                <w:rFonts w:ascii="Consolas" w:hAnsi="Consolas" w:eastAsia="Malgun Gothic"/>
-                <w:color w:val="1F4D78"/>
-                <w:sz w:val="17"/>
-              </w:rPr>
-              <w:t>KAKAO_ALIMTALK_ENABLED</w:t>
-            </w:r>
-            <w:r>
-              <w:rPr>
-                <w:rFonts w:ascii="Calibri" w:hAnsi="Calibri" w:eastAsia="Malgun Gothic"/>
-                <w:color w:val="1F2937"/>
-                <w:sz w:val="17"/>
-              </w:rPr>
-              <w:t xml:space="preserve">, </w:t>
-            </w:r>
-            <w:r>
-              <w:rPr>
-                <w:rFonts w:ascii="Consolas" w:hAnsi="Consolas" w:eastAsia="Malgun Gothic"/>
-                <w:color w:val="1F4D78"/>
-                <w:sz w:val="17"/>
-              </w:rPr>
-              <w:t>NCP_BIZ_MESSAGE_SERVICE_ID</w:t>
-            </w:r>
-            <w:r>
-              <w:rPr>
-                <w:rFonts w:ascii="Calibri" w:hAnsi="Calibri" w:eastAsia="Malgun Gothic"/>
-                <w:color w:val="1F2937"/>
-                <w:sz w:val="17"/>
-              </w:rPr>
-              <w:t xml:space="preserve">, </w:t>
-            </w:r>
-            <w:r>
-              <w:rPr>
-                <w:rFonts w:ascii="Consolas" w:hAnsi="Consolas" w:eastAsia="Malgun Gothic"/>
-                <w:color w:val="1F4D78"/>
-                <w:sz w:val="17"/>
-              </w:rPr>
-              <w:t>KAKAO_CHANNEL_ID</w:t>
-            </w:r>
-            <w:r>
-              <w:rPr>
-                <w:rFonts w:ascii="Calibri" w:hAnsi="Calibri" w:eastAsia="Malgun Gothic"/>
-                <w:color w:val="1F2937"/>
-                <w:sz w:val="17"/>
-              </w:rPr>
-              <w:t xml:space="preserve">, </w:t>
-            </w:r>
-            <w:r>
-              <w:rPr>
-                <w:rFonts w:ascii="Consolas" w:hAnsi="Consolas" w:eastAsia="Malgun Gothic"/>
-                <w:color w:val="1F4D78"/>
-                <w:sz w:val="17"/>
-              </w:rPr>
-              <w:t>KAKAO_TEMPLATE_*</w:t>
-            </w:r>
-          </w:p>
-        </w:tc>
-        <w:tc>
-          <w:tcPr>
-            <w:tcW w:type="dxa" w:w="3960"/>
-            <w:tcMar>
-              <w:top w:w="80" w:type="dxa"/>
-              <w:start w:w="120" w:type="dxa"/>
-              <w:bottom w:w="80" w:type="dxa"/>
-              <w:end w:w="120" w:type="dxa"/>
-            </w:tcMar>
-            <w:vAlign w:val="center"/>
-          </w:tcPr>
-          <w:p>
-            <w:pPr>
-              <w:spacing w:after="0" w:line="259" w:lineRule="auto"/>
-            </w:pPr>
-            <w:r/>
-            <w:r>
-              <w:rPr>
-                <w:rFonts w:ascii="Calibri" w:hAnsi="Calibri" w:eastAsia="Malgun Gothic"/>
-                <w:color w:val="1F2937"/>
-                <w:sz w:val="17"/>
-              </w:rPr>
-              <w:t>템플릿 승인 후 활성화</w:t>
-            </w:r>
-          </w:p>
-        </w:tc>
-      </w:tr>
-      <w:tr>
-        <w:trPr>
-          <w:cantSplit/>
-        </w:trPr>
-        <w:tc>
-          <w:tcPr>
-            <w:tcW w:type="dxa" w:w="1700"/>
-            <w:shd w:fill="F8FAFC"/>
-            <w:tcMar>
-              <w:top w:w="80" w:type="dxa"/>
-              <w:start w:w="120" w:type="dxa"/>
-              <w:bottom w:w="80" w:type="dxa"/>
-              <w:end w:w="120" w:type="dxa"/>
-            </w:tcMar>
-            <w:vAlign w:val="center"/>
-          </w:tcPr>
-          <w:p>
-            <w:pPr>
-              <w:spacing w:after="0" w:line="259" w:lineRule="auto"/>
-              <w:jc w:val="center"/>
-            </w:pPr>
-            <w:r/>
-            <w:r>
-              <w:rPr>
-                <w:rFonts w:ascii="Calibri" w:hAnsi="Calibri" w:eastAsia="Malgun Gothic"/>
-                <w:color w:val="1F2937"/>
-                <w:sz w:val="17"/>
-              </w:rPr>
-              <w:t>카카오 챗봇</w:t>
-            </w:r>
-          </w:p>
-        </w:tc>
-        <w:tc>
-          <w:tcPr>
-            <w:tcW w:type="dxa" w:w="3700"/>
-            <w:shd w:fill="F8FAFC"/>
-            <w:tcMar>
-              <w:top w:w="80" w:type="dxa"/>
-              <w:start w:w="120" w:type="dxa"/>
-              <w:bottom w:w="80" w:type="dxa"/>
-              <w:end w:w="120" w:type="dxa"/>
-            </w:tcMar>
-            <w:vAlign w:val="center"/>
-          </w:tcPr>
-          <w:p>
-            <w:pPr>
-              <w:spacing w:after="0" w:line="259" w:lineRule="auto"/>
-            </w:pPr>
-            <w:r/>
-            <w:r>
-              <w:rPr>
-                <w:rFonts w:ascii="Consolas" w:hAnsi="Consolas" w:eastAsia="Malgun Gothic"/>
-                <w:color w:val="1F4D78"/>
-                <w:sz w:val="17"/>
-              </w:rPr>
-              <w:t>KAKAO_CHATBOT_INTAKE_ENABLED</w:t>
-            </w:r>
-            <w:r>
-              <w:rPr>
-                <w:rFonts w:ascii="Calibri" w:hAnsi="Calibri" w:eastAsia="Malgun Gothic"/>
-                <w:color w:val="1F2937"/>
-                <w:sz w:val="17"/>
-              </w:rPr>
-              <w:t xml:space="preserve">, </w:t>
-            </w:r>
-            <w:r>
-              <w:rPr>
-                <w:rFonts w:ascii="Consolas" w:hAnsi="Consolas" w:eastAsia="Malgun Gothic"/>
-                <w:color w:val="1F4D78"/>
-                <w:sz w:val="17"/>
-              </w:rPr>
-              <w:t>KAKAO_CHATBOT_SKILL_TOKEN</w:t>
-            </w:r>
-            <w:r>
-              <w:rPr>
-                <w:rFonts w:ascii="Calibri" w:hAnsi="Calibri" w:eastAsia="Malgun Gothic"/>
-                <w:color w:val="1F2937"/>
-                <w:sz w:val="17"/>
-              </w:rPr>
-              <w:t xml:space="preserve">, </w:t>
-            </w:r>
-            <w:r>
-              <w:rPr>
-                <w:rFonts w:ascii="Consolas" w:hAnsi="Consolas" w:eastAsia="Malgun Gothic"/>
-                <w:color w:val="1F4D78"/>
-                <w:sz w:val="17"/>
-              </w:rPr>
-              <w:t>KAKAO_CHATBOT_BOT_ID</w:t>
-            </w:r>
-            <w:r>
-              <w:rPr>
-                <w:rFonts w:ascii="Calibri" w:hAnsi="Calibri" w:eastAsia="Malgun Gothic"/>
-                <w:color w:val="1F2937"/>
-                <w:sz w:val="17"/>
-              </w:rPr>
-              <w:t xml:space="preserve">, </w:t>
-            </w:r>
-            <w:r>
-              <w:rPr>
-                <w:rFonts w:ascii="Consolas" w:hAnsi="Consolas" w:eastAsia="Malgun Gothic"/>
-                <w:color w:val="1F4D78"/>
-                <w:sz w:val="17"/>
-              </w:rPr>
-              <w:t>KAKAO_CHATBOT_PHOTO_BLOCK_ID</w:t>
-            </w:r>
-          </w:p>
-        </w:tc>
-        <w:tc>
-          <w:tcPr>
-            <w:tcW w:type="dxa" w:w="3960"/>
-            <w:shd w:fill="F8FAFC"/>
-            <w:tcMar>
-              <w:top w:w="80" w:type="dxa"/>
-              <w:start w:w="120" w:type="dxa"/>
-              <w:bottom w:w="80" w:type="dxa"/>
-              <w:end w:w="120" w:type="dxa"/>
-            </w:tcMar>
-            <w:vAlign w:val="center"/>
-          </w:tcPr>
-          <w:p>
-            <w:pPr>
-              <w:spacing w:after="0" w:line="259" w:lineRule="auto"/>
-            </w:pPr>
-            <w:r/>
-            <w:r>
-              <w:rPr>
-                <w:rFonts w:ascii="Calibri" w:hAnsi="Calibri" w:eastAsia="Malgun Gothic"/>
-                <w:color w:val="1F2937"/>
-                <w:sz w:val="17"/>
-              </w:rPr>
-              <w:t>토큰 공개 금지</w:t>
-            </w:r>
-          </w:p>
-        </w:tc>
-      </w:tr>
-      <w:tr>
-        <w:trPr>
-          <w:cantSplit/>
-        </w:trPr>
-        <w:tc>
-          <w:tcPr>
-            <w:tcW w:type="dxa" w:w="1700"/>
-            <w:tcMar>
-              <w:top w:w="80" w:type="dxa"/>
-              <w:start w:w="120" w:type="dxa"/>
-              <w:bottom w:w="80" w:type="dxa"/>
-              <w:end w:w="120" w:type="dxa"/>
-            </w:tcMar>
-            <w:vAlign w:val="center"/>
-          </w:tcPr>
-          <w:p>
-            <w:pPr>
-              <w:spacing w:after="0" w:line="259" w:lineRule="auto"/>
-              <w:jc w:val="center"/>
-            </w:pPr>
-            <w:r/>
-            <w:r>
-              <w:rPr>
-                <w:rFonts w:ascii="Calibri" w:hAnsi="Calibri" w:eastAsia="Malgun Gothic"/>
-                <w:color w:val="1F2937"/>
-                <w:sz w:val="17"/>
-              </w:rPr>
-              <w:t>팝빌</w:t>
-            </w:r>
-          </w:p>
-        </w:tc>
-        <w:tc>
-          <w:tcPr>
-            <w:tcW w:type="dxa" w:w="3700"/>
-            <w:tcMar>
-              <w:top w:w="80" w:type="dxa"/>
-              <w:start w:w="120" w:type="dxa"/>
-              <w:bottom w:w="80" w:type="dxa"/>
-              <w:end w:w="120" w:type="dxa"/>
-            </w:tcMar>
-            <w:vAlign w:val="center"/>
-          </w:tcPr>
-          <w:p>
-            <w:pPr>
-              <w:spacing w:after="0" w:line="259" w:lineRule="auto"/>
-            </w:pPr>
-            <w:r/>
-            <w:r>
-              <w:rPr>
-                <w:rFonts w:ascii="Consolas" w:hAnsi="Consolas" w:eastAsia="Malgun Gothic"/>
-                <w:color w:val="1F4D78"/>
-                <w:sz w:val="17"/>
-              </w:rPr>
-              <w:t>POPBILL_IS_TEST</w:t>
-            </w:r>
-            <w:r>
-              <w:rPr>
-                <w:rFonts w:ascii="Calibri" w:hAnsi="Calibri" w:eastAsia="Malgun Gothic"/>
-                <w:color w:val="1F2937"/>
-                <w:sz w:val="17"/>
-              </w:rPr>
-              <w:t xml:space="preserve">, </w:t>
-            </w:r>
-            <w:r>
-              <w:rPr>
-                <w:rFonts w:ascii="Consolas" w:hAnsi="Consolas" w:eastAsia="Malgun Gothic"/>
-                <w:color w:val="1F4D78"/>
-                <w:sz w:val="17"/>
-              </w:rPr>
-              <w:t>POPBILL_LINK_ID</w:t>
-            </w:r>
-            <w:r>
-              <w:rPr>
-                <w:rFonts w:ascii="Calibri" w:hAnsi="Calibri" w:eastAsia="Malgun Gothic"/>
-                <w:color w:val="1F2937"/>
-                <w:sz w:val="17"/>
-              </w:rPr>
-              <w:t xml:space="preserve">, </w:t>
-            </w:r>
-            <w:r>
-              <w:rPr>
-                <w:rFonts w:ascii="Consolas" w:hAnsi="Consolas" w:eastAsia="Malgun Gothic"/>
-                <w:color w:val="1F4D78"/>
-                <w:sz w:val="17"/>
-              </w:rPr>
-              <w:t>POPBILL_SECRET_KEY</w:t>
-            </w:r>
-            <w:r>
-              <w:rPr>
-                <w:rFonts w:ascii="Calibri" w:hAnsi="Calibri" w:eastAsia="Malgun Gothic"/>
-                <w:color w:val="1F2937"/>
-                <w:sz w:val="17"/>
-              </w:rPr>
-              <w:t xml:space="preserve">, </w:t>
-            </w:r>
-            <w:r>
-              <w:rPr>
-                <w:rFonts w:ascii="Consolas" w:hAnsi="Consolas" w:eastAsia="Malgun Gothic"/>
-                <w:color w:val="1F4D78"/>
-                <w:sz w:val="17"/>
-              </w:rPr>
-              <w:t>POPBILL_CORP_NUM</w:t>
-            </w:r>
-            <w:r>
-              <w:rPr>
-                <w:rFonts w:ascii="Calibri" w:hAnsi="Calibri" w:eastAsia="Malgun Gothic"/>
-                <w:color w:val="1F2937"/>
-                <w:sz w:val="17"/>
-              </w:rPr>
-              <w:t xml:space="preserve">, </w:t>
-            </w:r>
-            <w:r>
-              <w:rPr>
-                <w:rFonts w:ascii="Consolas" w:hAnsi="Consolas" w:eastAsia="Malgun Gothic"/>
-                <w:color w:val="1F4D78"/>
-                <w:sz w:val="17"/>
-              </w:rPr>
-              <w:t>POPBILL_USER_ID</w:t>
-            </w:r>
-          </w:p>
-        </w:tc>
-        <w:tc>
-          <w:tcPr>
-            <w:tcW w:type="dxa" w:w="3960"/>
-            <w:tcMar>
-              <w:top w:w="80" w:type="dxa"/>
-              <w:start w:w="120" w:type="dxa"/>
-              <w:bottom w:w="80" w:type="dxa"/>
-              <w:end w:w="120" w:type="dxa"/>
-            </w:tcMar>
-            <w:vAlign w:val="center"/>
-          </w:tcPr>
-          <w:p>
-            <w:pPr>
-              <w:spacing w:after="0" w:line="259" w:lineRule="auto"/>
-            </w:pPr>
-            <w:r/>
-            <w:r>
-              <w:rPr>
-                <w:rFonts w:ascii="Calibri" w:hAnsi="Calibri" w:eastAsia="Malgun Gothic"/>
-                <w:color w:val="1F2937"/>
-                <w:sz w:val="17"/>
-              </w:rPr>
-              <w:t>SecretKey 공개 금지</w:t>
-            </w:r>
-          </w:p>
-        </w:tc>
-      </w:tr>
-      <w:tr>
-        <w:trPr>
-          <w:cantSplit/>
-        </w:trPr>
-        <w:tc>
-          <w:tcPr>
-            <w:tcW w:type="dxa" w:w="1700"/>
-            <w:shd w:fill="F8FAFC"/>
-            <w:tcMar>
-              <w:top w:w="80" w:type="dxa"/>
-              <w:start w:w="120" w:type="dxa"/>
-              <w:bottom w:w="80" w:type="dxa"/>
-              <w:end w:w="120" w:type="dxa"/>
-            </w:tcMar>
-            <w:vAlign w:val="center"/>
-          </w:tcPr>
-          <w:p>
-            <w:pPr>
-              <w:spacing w:after="0" w:line="259" w:lineRule="auto"/>
-              <w:jc w:val="center"/>
-            </w:pPr>
-            <w:r/>
-            <w:r>
-              <w:rPr>
-                <w:rFonts w:ascii="Calibri" w:hAnsi="Calibri" w:eastAsia="Malgun Gothic"/>
-                <w:color w:val="1F2937"/>
-                <w:sz w:val="17"/>
-              </w:rPr>
-              <w:t>입금 관리</w:t>
-            </w:r>
-          </w:p>
-        </w:tc>
-        <w:tc>
-          <w:tcPr>
-            <w:tcW w:type="dxa" w:w="3700"/>
-            <w:shd w:fill="F8FAFC"/>
-            <w:tcMar>
-              <w:top w:w="80" w:type="dxa"/>
-              <w:start w:w="120" w:type="dxa"/>
-              <w:bottom w:w="80" w:type="dxa"/>
-              <w:end w:w="120" w:type="dxa"/>
-            </w:tcMar>
-            <w:vAlign w:val="center"/>
-          </w:tcPr>
-          <w:p>
-            <w:pPr>
-              <w:spacing w:after="0" w:line="259" w:lineRule="auto"/>
-            </w:pPr>
-            <w:r/>
-            <w:r>
-              <w:rPr>
-                <w:rFonts w:ascii="Consolas" w:hAnsi="Consolas" w:eastAsia="Malgun Gothic"/>
-                <w:color w:val="1F4D78"/>
-                <w:sz w:val="17"/>
-              </w:rPr>
-              <w:t>PAYMENT_SCHEDULE_SPREADSHEET_ID</w:t>
-            </w:r>
-          </w:p>
-        </w:tc>
-        <w:tc>
-          <w:tcPr>
-            <w:tcW w:type="dxa" w:w="3960"/>
-            <w:shd w:fill="F8FAFC"/>
-            <w:tcMar>
-              <w:top w:w="80" w:type="dxa"/>
-              <w:start w:w="120" w:type="dxa"/>
-              <w:bottom w:w="80" w:type="dxa"/>
-              <w:end w:w="120" w:type="dxa"/>
-            </w:tcMar>
-            <w:vAlign w:val="center"/>
-          </w:tcPr>
-          <w:p>
-            <w:pPr>
-              <w:spacing w:after="0" w:line="259" w:lineRule="auto"/>
-            </w:pPr>
-            <w:r/>
-            <w:r>
-              <w:rPr>
-                <w:rFonts w:ascii="Calibri" w:hAnsi="Calibri" w:eastAsia="Malgun Gothic"/>
-                <w:color w:val="1F2937"/>
-                <w:sz w:val="17"/>
-              </w:rPr>
-              <w:t>계정별 캘린더와 혼동 금지</w:t>
-            </w:r>
-          </w:p>
-        </w:tc>
-      </w:tr>
-    </w:tbl>
-    <w:p>
-      <w:pPr>
-        <w:spacing w:after="40"/>
-      </w:pPr>
-    </w:p>
-    <w:p>
-      <w:pPr>
-        <w:spacing w:before="80" w:after="160"/>
-        <w:ind w:left="259" w:right="259"/>
-        <w:shd w:fill="FFF7DF"/>
-        <w:pBdr>
-          <w:left w:val="single" w:sz="18" w:space="8" w:color="C69214"/>
-        </w:pBdr>
-      </w:pPr>
-      <w:r>
-        <w:rPr>
-          <w:rFonts w:ascii="Calibri" w:hAnsi="Calibri" w:eastAsia="Malgun Gothic"/>
-          <w:color w:val="1F2937"/>
-          <w:sz w:val="20"/>
-        </w:rPr>
-        <w:t>속성의 실제 비밀값은 이 문서와 GitHub에 적지 않습니다. 계정 책임자의 비밀번호 관리 도구에서 별도로 인계합니다.</w:t>
-      </w:r>
-    </w:p>
-    <w:p>
-      <w:pPr>
-        <w:pStyle w:val="Heading1"/>
-      </w:pPr>
-      <w:r>
-        <w:rPr>
-          <w:rFonts w:ascii="Calibri" w:hAnsi="Calibri" w:eastAsia="Malgun Gothic"/>
-          <w:color w:val="2E74B5"/>
-          <w:sz w:val="32"/>
-        </w:rPr>
-        <w:t>11. GitHub Pages 배포</w:t>
+        <w:t>10. GitHub Pages 배포</w:t>
       </w:r>
     </w:p>
     <w:p>
@@ -8372,7 +6685,7 @@
           <w:color w:val="2E74B5"/>
           <w:sz w:val="32"/>
         </w:rPr>
-        <w:t>12. 자주 발생하는 문제</w:t>
+        <w:t>11. 자주 발생하는 문제</w:t>
       </w:r>
     </w:p>
     <w:tbl>
@@ -8737,15 +7050,7 @@
                 <w:color w:val="1F2937"/>
                 <w:sz w:val="17"/>
               </w:rPr>
-              <w:t xml:space="preserve">발신번호 승인 상태와 </w:t>
-            </w:r>
-            <w:r>
-              <w:rPr>
-                <w:rFonts w:ascii="Consolas" w:hAnsi="Consolas" w:eastAsia="Malgun Gothic"/>
-                <w:color w:val="1F4D78"/>
-                <w:sz w:val="17"/>
-              </w:rPr>
-              <w:t>NCP_SENS_FROM</w:t>
+              <w:t>발신번호 승인 상태</w:t>
             </w:r>
           </w:p>
         </w:tc>
@@ -8771,7 +7076,7 @@
                 <w:color w:val="1F2937"/>
                 <w:sz w:val="17"/>
               </w:rPr>
-              <w:t>승인된 번호를 하이픈 없이 저장 후 재배포 불필요, 재시도</w:t>
+              <w:t>승인된 발신번호인지 확인한 뒤 시스템 관리자에게 재시도 요청</w:t>
             </w:r>
           </w:p>
         </w:tc>
@@ -8998,19 +7303,11 @@
             <w:r/>
             <w:r>
               <w:rPr>
-                <w:rFonts w:ascii="Consolas" w:hAnsi="Consolas" w:eastAsia="Malgun Gothic"/>
-                <w:color w:val="1F4D78"/>
-                <w:sz w:val="17"/>
-              </w:rPr>
-              <w:t>MINERU_SYNC_ENABLED</w:t>
-            </w:r>
-            <w:r>
-              <w:rPr>
                 <w:rFonts w:ascii="Calibri" w:hAnsi="Calibri" w:eastAsia="Malgun Gothic"/>
                 <w:color w:val="1F2937"/>
                 <w:sz w:val="17"/>
               </w:rPr>
-              <w:t>, 파일 크기</w:t>
+              <w:t>파일 크기와 분석 대기 상태</w:t>
             </w:r>
           </w:p>
         </w:tc>
@@ -9037,23 +7334,7 @@
                 <w:color w:val="1F2937"/>
                 <w:sz w:val="17"/>
               </w:rPr>
-              <w:t xml:space="preserve">기본값 </w:t>
-            </w:r>
-            <w:r>
-              <w:rPr>
-                <w:rFonts w:ascii="Consolas" w:hAnsi="Consolas" w:eastAsia="Malgun Gothic"/>
-                <w:color w:val="1F4D78"/>
-                <w:sz w:val="17"/>
-              </w:rPr>
-              <w:t>false</w:t>
-            </w:r>
-            <w:r>
-              <w:rPr>
-                <w:rFonts w:ascii="Calibri" w:hAnsi="Calibri" w:eastAsia="Malgun Gothic"/>
-                <w:color w:val="1F2937"/>
-                <w:sz w:val="17"/>
-              </w:rPr>
-              <w:t>, 파일 5MB 이하 확인</w:t>
+              <w:t>파일 5MB 이하인지 확인하고 완료될 때까지 같은 파일을 다시 올리지 않음</w:t>
             </w:r>
           </w:p>
         </w:tc>
@@ -9111,7 +7392,7 @@
                 <w:color w:val="1F2937"/>
                 <w:sz w:val="17"/>
               </w:rPr>
-              <w:t>업체명/사업자번호 매칭, OCR 권한</w:t>
+              <w:t>업체명/사업자번호 매칭</w:t>
             </w:r>
           </w:p>
         </w:tc>
@@ -9137,7 +7418,7 @@
                 <w:color w:val="1F2937"/>
                 <w:sz w:val="17"/>
               </w:rPr>
-              <w:t>이름 정리, Drive API, MinerU 키 확인 후 재작성</w:t>
+              <w:t>견적서와 사업자등록증의 업체명을 확인한 뒤 재작성</w:t>
             </w:r>
           </w:p>
         </w:tc>
@@ -9197,7 +7478,7 @@
                 <w:color w:val="1F2937"/>
                 <w:sz w:val="17"/>
               </w:rPr>
-              <w:t>오래 열린 브라우저, 전체 저장 코드</w:t>
+              <w:t>오래 열린 브라우저, 여러 탭 동시 수정</w:t>
             </w:r>
           </w:p>
         </w:tc>
@@ -9224,23 +7505,7 @@
                 <w:color w:val="1F2937"/>
                 <w:sz w:val="17"/>
               </w:rPr>
-              <w:t xml:space="preserve">새로고침 후 Firebase </w:t>
-            </w:r>
-            <w:r>
-              <w:rPr>
-                <w:rFonts w:ascii="Consolas" w:hAnsi="Consolas" w:eastAsia="Malgun Gothic"/>
-                <w:color w:val="1F4D78"/>
-                <w:sz w:val="17"/>
-              </w:rPr>
-              <w:t>automationState</w:t>
-            </w:r>
-            <w:r>
-              <w:rPr>
-                <w:rFonts w:ascii="Calibri" w:hAnsi="Calibri" w:eastAsia="Malgun Gothic"/>
-                <w:color w:val="1F2937"/>
-                <w:sz w:val="17"/>
-              </w:rPr>
-              <w:t xml:space="preserve"> 확인, 부분 업데이트 유지</w:t>
+              <w:t>다른 탭을 닫고 새로고침한 뒤 다시 처리</w:t>
             </w:r>
           </w:p>
         </w:tc>
@@ -9384,7 +7649,7 @@
                 <w:color w:val="1F2937"/>
                 <w:sz w:val="17"/>
               </w:rPr>
-              <w:t>Apps Script 최신 배포와 링크 사전검증</w:t>
+              <w:t>문자에 포함된 링크와 승인 화면 상태</w:t>
             </w:r>
           </w:p>
         </w:tc>
@@ -9411,7 +7676,7 @@
                 <w:color w:val="1F2937"/>
                 <w:sz w:val="17"/>
               </w:rPr>
-              <w:t>웹 앱 새 버전 배포 후 ⑧ 재시도</w:t>
+              <w:t>시스템 관리자에게 링크 재생성 후 ⑧ 재발송 요청</w:t>
             </w:r>
           </w:p>
         </w:tc>
@@ -9469,7 +7734,7 @@
                 <w:color w:val="1F2937"/>
                 <w:sz w:val="17"/>
               </w:rPr>
-              <w:t>SENS 요청 결과 저장, Firebase 업데이트</w:t>
+              <w:t>발송 결과와 케이스 기록</w:t>
             </w:r>
           </w:p>
         </w:tc>
@@ -9495,23 +7760,7 @@
                 <w:color w:val="1F2937"/>
                 <w:sz w:val="17"/>
               </w:rPr>
-              <w:t xml:space="preserve">실행 로그와 </w:t>
-            </w:r>
-            <w:r>
-              <w:rPr>
-                <w:rFonts w:ascii="Consolas" w:hAnsi="Consolas" w:eastAsia="Malgun Gothic"/>
-                <w:color w:val="1F4D78"/>
-                <w:sz w:val="17"/>
-              </w:rPr>
-              <w:t>ownerRecommendationMms</w:t>
-            </w:r>
-            <w:r>
-              <w:rPr>
-                <w:rFonts w:ascii="Calibri" w:hAnsi="Calibri" w:eastAsia="Malgun Gothic"/>
-                <w:color w:val="1F2937"/>
-                <w:sz w:val="17"/>
-              </w:rPr>
-              <w:t xml:space="preserve"> 확인</w:t>
+              <w:t>시스템 관리자에게 발송 기록과 케이스 ID 전달</w:t>
             </w:r>
           </w:p>
         </w:tc>
@@ -9571,7 +7820,7 @@
                 <w:color w:val="1F2937"/>
                 <w:sz w:val="17"/>
               </w:rPr>
-              <w:t>Apps Script 실행 계정의 폴더 권한</w:t>
+              <w:t>로그인 계정의 폴더 공유 권한</w:t>
             </w:r>
           </w:p>
         </w:tc>
@@ -9594,19 +7843,11 @@
             <w:r/>
             <w:r>
               <w:rPr>
-                <w:rFonts w:ascii="Consolas" w:hAnsi="Consolas" w:eastAsia="Malgun Gothic"/>
-                <w:color w:val="1F4D78"/>
-                <w:sz w:val="17"/>
-              </w:rPr>
-              <w:t>authorizeDriveAccess</w:t>
-            </w:r>
-            <w:r>
-              <w:rPr>
                 <w:rFonts w:ascii="Calibri" w:hAnsi="Calibri" w:eastAsia="Malgun Gothic"/>
                 <w:color w:val="1F2937"/>
                 <w:sz w:val="17"/>
               </w:rPr>
-              <w:t xml:space="preserve"> 실행, scope 승인, 새 배포</w:t>
+              <w:t>운영 Drive를 편집자로 다시 공유하고 재시도</w:t>
             </w:r>
           </w:p>
         </w:tc>
@@ -9798,7 +8039,7 @@
           <w:color w:val="2E74B5"/>
           <w:sz w:val="32"/>
         </w:rPr>
-        <w:t>13. 테스트 체크리스트</w:t>
+        <w:t>12. 테스트 체크리스트</w:t>
       </w:r>
     </w:p>
     <w:p>
@@ -9811,7 +8052,7 @@
           <w:color w:val="2E74B5"/>
           <w:sz w:val="26"/>
         </w:rPr>
-        <w:t>13.1 신규 건물 도입 테스트</w:t>
+        <w:t>12.1 신규 건물 도입 테스트</w:t>
       </w:r>
     </w:p>
     <w:p>
@@ -9954,7 +8195,7 @@
           <w:color w:val="2E74B5"/>
           <w:sz w:val="26"/>
         </w:rPr>
-        <w:t>13.2 배포 후 최소 점검</w:t>
+        <w:t>12.2 배포 후 최소 점검</w:t>
       </w:r>
     </w:p>
     <w:p>
@@ -9968,19 +8209,6 @@
           <w:sz w:val="21"/>
         </w:rPr>
         <w:t>관리자 화면 버전이 최신이다.</w:t>
-      </w:r>
-    </w:p>
-    <w:p>
-      <w:pPr>
-        <w:pStyle w:val="ListBullet"/>
-      </w:pPr>
-      <w:r>
-        <w:rPr>
-          <w:rFonts w:ascii="Calibri" w:hAnsi="Calibri" w:eastAsia="Malgun Gothic"/>
-          <w:color w:val="1F2937"/>
-          <w:sz w:val="21"/>
-        </w:rPr>
-        <w:t>Apps Script health 응답 빌드가 최신이다.</w:t>
       </w:r>
     </w:p>
     <w:p>
@@ -10076,7 +8304,7 @@
           <w:color w:val="2E74B5"/>
           <w:sz w:val="32"/>
         </w:rPr>
-        <w:t>14. 보안과 개인정보 주의</w:t>
+        <w:t>13. 보안과 개인정보 주의</w:t>
       </w:r>
     </w:p>
     <w:p>
@@ -10290,7 +8518,7 @@
           <w:color w:val="2E74B5"/>
           <w:sz w:val="32"/>
         </w:rPr>
-        <w:t>15. 인계 완료 확인표</w:t>
+        <w:t>14. 인계 완료 확인표</w:t>
       </w:r>
     </w:p>
     <w:tbl>
@@ -10998,7 +9226,7 @@
                 <w:color w:val="1F2937"/>
                 <w:sz w:val="17"/>
               </w:rPr>
-              <w:t>Apps Script 새 버전 배포 실습</w:t>
+              <w:t>비밀키 보관 위치 인계</w:t>
             </w:r>
           </w:p>
         </w:tc>
@@ -11067,7 +9295,7 @@
                 <w:color w:val="1F2937"/>
                 <w:sz w:val="17"/>
               </w:rPr>
-              <w:t>비밀키 보관 위치 인계</w:t>
+              <w:t>퇴사자 권한 회수 절차 확인</w:t>
             </w:r>
           </w:p>
         </w:tc>
@@ -11110,74 +9338,6 @@
           </w:p>
         </w:tc>
       </w:tr>
-      <w:tr>
-        <w:trPr>
-          <w:cantSplit/>
-        </w:trPr>
-        <w:tc>
-          <w:tcPr>
-            <w:tcW w:type="dxa" w:w="1700"/>
-            <w:tcMar>
-              <w:top w:w="80" w:type="dxa"/>
-              <w:start w:w="120" w:type="dxa"/>
-              <w:bottom w:w="80" w:type="dxa"/>
-              <w:end w:w="120" w:type="dxa"/>
-            </w:tcMar>
-            <w:vAlign w:val="center"/>
-          </w:tcPr>
-          <w:p>
-            <w:pPr>
-              <w:spacing w:after="0" w:line="259" w:lineRule="auto"/>
-              <w:jc w:val="center"/>
-            </w:pPr>
-            <w:r/>
-            <w:r>
-              <w:rPr>
-                <w:rFonts w:ascii="Calibri" w:hAnsi="Calibri" w:eastAsia="Malgun Gothic"/>
-                <w:color w:val="1F2937"/>
-                <w:sz w:val="17"/>
-              </w:rPr>
-              <w:t>퇴사자 권한 회수 절차 확인</w:t>
-            </w:r>
-          </w:p>
-        </w:tc>
-        <w:tc>
-          <w:tcPr>
-            <w:tcW w:type="dxa" w:w="3700"/>
-            <w:tcMar>
-              <w:top w:w="80" w:type="dxa"/>
-              <w:start w:w="120" w:type="dxa"/>
-              <w:bottom w:w="80" w:type="dxa"/>
-              <w:end w:w="120" w:type="dxa"/>
-            </w:tcMar>
-            <w:vAlign w:val="center"/>
-          </w:tcPr>
-          <w:p>
-            <w:pPr>
-              <w:spacing w:after="0" w:line="259" w:lineRule="auto"/>
-            </w:pPr>
-            <w:r/>
-          </w:p>
-        </w:tc>
-        <w:tc>
-          <w:tcPr>
-            <w:tcW w:type="dxa" w:w="3960"/>
-            <w:tcMar>
-              <w:top w:w="80" w:type="dxa"/>
-              <w:start w:w="120" w:type="dxa"/>
-              <w:bottom w:w="80" w:type="dxa"/>
-              <w:end w:w="120" w:type="dxa"/>
-            </w:tcMar>
-            <w:vAlign w:val="center"/>
-          </w:tcPr>
-          <w:p>
-            <w:pPr>
-              <w:spacing w:after="0" w:line="259" w:lineRule="auto"/>
-            </w:pPr>
-            <w:r/>
-          </w:p>
-        </w:tc>
-      </w:tr>
     </w:tbl>
     <w:p>
       <w:pPr>
@@ -11194,7 +9354,7 @@
           <w:color w:val="2E74B5"/>
           <w:sz w:val="32"/>
         </w:rPr>
-        <w:t>16. 인계 시 팀이 채울 연락처</w:t>
+        <w:t>15. 인계 시 팀이 채울 연락처</w:t>
       </w:r>
     </w:p>
     <w:tbl>
@@ -11889,23 +10049,7 @@
           <w:color w:val="1F2937"/>
           <w:sz w:val="22"/>
         </w:rPr>
-        <w:t xml:space="preserve">이 문서는 팀 운영의 시작점입니다. 세부 Apps Script 설치·템플릿·테스트 절차는 </w:t>
-      </w:r>
-      <w:r>
-        <w:rPr>
-          <w:rFonts w:ascii="Consolas" w:hAnsi="Consolas" w:eastAsia="Malgun Gothic"/>
-          <w:color w:val="1F4D78"/>
-          <w:sz w:val="22"/>
-        </w:rPr>
-        <w:t>apps-script/README.md</w:t>
-      </w:r>
-      <w:r>
-        <w:rPr>
-          <w:rFonts w:ascii="Calibri" w:hAnsi="Calibri" w:eastAsia="Malgun Gothic"/>
-          <w:color w:val="1F2937"/>
-          <w:sz w:val="22"/>
-        </w:rPr>
-        <w:t xml:space="preserve">, 코드 구조와 최신 변경사항은 </w:t>
+        <w:t xml:space="preserve">이 문서는 팀 운영의 시작점입니다. 화면 기능과 최신 변경사항은 </w:t>
       </w:r>
       <w:r>
         <w:rPr>
@@ -11921,39 +10065,7 @@
           <w:color w:val="1F2937"/>
           <w:sz w:val="22"/>
         </w:rPr>
-        <w:t xml:space="preserve">와 </w:t>
-      </w:r>
-      <w:r>
-        <w:rPr>
-          <w:rFonts w:ascii="Consolas" w:hAnsi="Consolas" w:eastAsia="Malgun Gothic"/>
-          <w:color w:val="1F4D78"/>
-          <w:sz w:val="22"/>
-        </w:rPr>
-        <w:t>index.html</w:t>
-      </w:r>
-      <w:r>
-        <w:rPr>
-          <w:rFonts w:ascii="Calibri" w:hAnsi="Calibri" w:eastAsia="Malgun Gothic"/>
-          <w:color w:val="1F2937"/>
-          <w:sz w:val="22"/>
-        </w:rPr>
-        <w:t xml:space="preserve">의 </w:t>
-      </w:r>
-      <w:r>
-        <w:rPr>
-          <w:rFonts w:ascii="Consolas" w:hAnsi="Consolas" w:eastAsia="Malgun Gothic"/>
-          <w:color w:val="1F4D78"/>
-          <w:sz w:val="22"/>
-        </w:rPr>
-        <w:t>CHANGELOG</w:t>
-      </w:r>
-      <w:r>
-        <w:rPr>
-          <w:rFonts w:ascii="Calibri" w:hAnsi="Calibri" w:eastAsia="Malgun Gothic"/>
-          <w:color w:val="1F2937"/>
-          <w:sz w:val="22"/>
-        </w:rPr>
-        <w:t>를 함께 확인합니다.</w:t>
+        <w:t>와 관리자 화면의 업데이트 내역을 함께 확인합니다.</w:t>
       </w:r>
     </w:p>
     <w:sectPr>

</xml_diff>

<commit_message>
Add case UI screenshots to handover guide
</commit_message>
<xml_diff>
--- a/deliverables/BRING_Care_팀_운영_인수인계서_20260803.docx
+++ b/deliverables/BRING_Care_팀_운영_인수인계서_20260803.docx
@@ -592,6 +592,62 @@
           <w:sz w:val="21"/>
         </w:rPr>
         <w:t>으로 바뀌었는지 확인합니다.</w:t>
+      </w:r>
+    </w:p>
+    <w:p>
+      <w:pPr>
+        <w:keepLines/>
+        <w:spacing w:before="120" w:after="40"/>
+        <w:jc w:val="center"/>
+      </w:pPr>
+      <w:r>
+        <w:drawing>
+          <wp:inline xmlns:a="http://schemas.openxmlformats.org/drawingml/2006/main" xmlns:pic="http://schemas.openxmlformats.org/drawingml/2006/picture">
+            <wp:extent cx="5623560" cy="3163252"/>
+            <wp:docPr id="1" name="Picture 1"/>
+            <wp:cNvGraphicFramePr>
+              <a:graphicFrameLocks noChangeAspect="1"/>
+            </wp:cNvGraphicFramePr>
+            <a:graphic>
+              <a:graphicData uri="http://schemas.openxmlformats.org/drawingml/2006/picture">
+                <pic:pic>
+                  <pic:nvPicPr>
+                    <pic:cNvPr id="0" name="case-overview.png"/>
+                    <pic:cNvPicPr/>
+                  </pic:nvPicPr>
+                  <pic:blipFill>
+                    <a:blip r:embed="rId11"/>
+                    <a:stretch>
+                      <a:fillRect/>
+                    </a:stretch>
+                  </pic:blipFill>
+                  <pic:spPr>
+                    <a:xfrm>
+                      <a:off x="0" y="0"/>
+                      <a:ext cx="5623560" cy="3163252"/>
+                    </a:xfrm>
+                    <a:prstGeom prst="rect"/>
+                  </pic:spPr>
+                </pic:pic>
+              </a:graphicData>
+            </a:graphic>
+          </wp:inline>
+        </w:drawing>
+      </w:r>
+    </w:p>
+    <w:p>
+      <w:pPr>
+        <w:spacing w:after="200"/>
+        <w:jc w:val="center"/>
+      </w:pPr>
+      <w:r>
+        <w:rPr>
+          <w:rFonts w:ascii="Calibri" w:hAnsi="Calibri" w:eastAsia="Malgun Gothic"/>
+          <w:i/>
+          <w:color w:val="667085"/>
+          <w:sz w:val="17"/>
+        </w:rPr>
+        <w:t>화면 1. 케이스 목록과 기본 정보: 왼쪽에서 케이스를 선택하고, 오른쪽에서 접수 정보와 현재 진행 단계를 확인합니다.</w:t>
       </w:r>
     </w:p>
     <w:p>
@@ -4103,6 +4159,62 @@
     </w:p>
     <w:p>
       <w:pPr>
+        <w:keepLines/>
+        <w:spacing w:before="120" w:after="40"/>
+        <w:jc w:val="center"/>
+      </w:pPr>
+      <w:r>
+        <w:drawing>
+          <wp:inline xmlns:a="http://schemas.openxmlformats.org/drawingml/2006/main" xmlns:pic="http://schemas.openxmlformats.org/drawingml/2006/picture">
+            <wp:extent cx="5623560" cy="1682963"/>
+            <wp:docPr id="2" name="Picture 2"/>
+            <wp:cNvGraphicFramePr>
+              <a:graphicFrameLocks noChangeAspect="1"/>
+            </wp:cNvGraphicFramePr>
+            <a:graphic>
+              <a:graphicData uri="http://schemas.openxmlformats.org/drawingml/2006/picture">
+                <pic:pic>
+                  <pic:nvPicPr>
+                    <pic:cNvPr id="0" name="vendor-selection.png"/>
+                    <pic:cNvPicPr/>
+                  </pic:nvPicPr>
+                  <pic:blipFill>
+                    <a:blip r:embed="rId12"/>
+                    <a:stretch>
+                      <a:fillRect/>
+                    </a:stretch>
+                  </pic:blipFill>
+                  <pic:spPr>
+                    <a:xfrm>
+                      <a:off x="0" y="0"/>
+                      <a:ext cx="5623560" cy="1682963"/>
+                    </a:xfrm>
+                    <a:prstGeom prst="rect"/>
+                  </pic:spPr>
+                </pic:pic>
+              </a:graphicData>
+            </a:graphic>
+          </wp:inline>
+        </w:drawing>
+      </w:r>
+    </w:p>
+    <w:p>
+      <w:pPr>
+        <w:spacing w:after="200"/>
+        <w:jc w:val="center"/>
+      </w:pPr>
+      <w:r>
+        <w:rPr>
+          <w:rFonts w:ascii="Calibri" w:hAnsi="Calibri" w:eastAsia="Malgun Gothic"/>
+          <w:i/>
+          <w:color w:val="667085"/>
+          <w:sz w:val="17"/>
+        </w:rPr>
+        <w:t>화면 2. 업체 선택: 업체명, 연락처, 주소와 서비스 내용을 비교한 뒤 문자 발송이 가능한 업체를 선택합니다.</w:t>
+      </w:r>
+    </w:p>
+    <w:p>
+      <w:pPr>
         <w:spacing w:before="80" w:after="160"/>
         <w:ind w:left="259" w:right="259"/>
         <w:shd w:fill="FFF7DF"/>
@@ -4715,6 +4827,62 @@
     </w:p>
     <w:p>
       <w:pPr>
+        <w:keepLines/>
+        <w:spacing w:before="120" w:after="40"/>
+        <w:jc w:val="center"/>
+      </w:pPr>
+      <w:r>
+        <w:drawing>
+          <wp:inline xmlns:a="http://schemas.openxmlformats.org/drawingml/2006/main" xmlns:pic="http://schemas.openxmlformats.org/drawingml/2006/picture">
+            <wp:extent cx="5623560" cy="2315584"/>
+            <wp:docPr id="3" name="Picture 3"/>
+            <wp:cNvGraphicFramePr>
+              <a:graphicFrameLocks noChangeAspect="1"/>
+            </wp:cNvGraphicFramePr>
+            <a:graphic>
+              <a:graphicData uri="http://schemas.openxmlformats.org/drawingml/2006/picture">
+                <pic:pic>
+                  <pic:nvPicPr>
+                    <pic:cNvPr id="0" name="quote-upload.png"/>
+                    <pic:cNvPicPr/>
+                  </pic:nvPicPr>
+                  <pic:blipFill>
+                    <a:blip r:embed="rId13"/>
+                    <a:stretch>
+                      <a:fillRect/>
+                    </a:stretch>
+                  </pic:blipFill>
+                  <pic:spPr>
+                    <a:xfrm>
+                      <a:off x="0" y="0"/>
+                      <a:ext cx="5623560" cy="2315584"/>
+                    </a:xfrm>
+                    <a:prstGeom prst="rect"/>
+                  </pic:spPr>
+                </pic:pic>
+              </a:graphicData>
+            </a:graphic>
+          </wp:inline>
+        </w:drawing>
+      </w:r>
+    </w:p>
+    <w:p>
+      <w:pPr>
+        <w:spacing w:after="200"/>
+        <w:jc w:val="center"/>
+      </w:pPr>
+      <w:r>
+        <w:rPr>
+          <w:rFonts w:ascii="Calibri" w:hAnsi="Calibri" w:eastAsia="Malgun Gothic"/>
+          <w:i/>
+          <w:color w:val="667085"/>
+          <w:sz w:val="17"/>
+        </w:rPr>
+        <w:t>화면 3. 견적 파일 업로드: 왼쪽에는 견적서, 오른쪽에는 사업자등록증을 넣고 선택 파일을 한 번에 업로드합니다.</w:t>
+      </w:r>
+    </w:p>
+    <w:p>
+      <w:pPr>
         <w:pStyle w:val="Heading2"/>
       </w:pPr>
       <w:r>
@@ -5090,6 +5258,62 @@
           <w:sz w:val="21"/>
         </w:rPr>
         <w:t>추천 이미지가 만들어지면 ⑧로 넘어갑니다.</w:t>
+      </w:r>
+    </w:p>
+    <w:p>
+      <w:pPr>
+        <w:keepLines/>
+        <w:spacing w:before="120" w:after="40"/>
+        <w:jc w:val="center"/>
+      </w:pPr>
+      <w:r>
+        <w:drawing>
+          <wp:inline xmlns:a="http://schemas.openxmlformats.org/drawingml/2006/main" xmlns:pic="http://schemas.openxmlformats.org/drawingml/2006/picture">
+            <wp:extent cx="5623560" cy="2315584"/>
+            <wp:docPr id="4" name="Picture 4"/>
+            <wp:cNvGraphicFramePr>
+              <a:graphicFrameLocks noChangeAspect="1"/>
+            </wp:cNvGraphicFramePr>
+            <a:graphic>
+              <a:graphicData uri="http://schemas.openxmlformats.org/drawingml/2006/picture">
+                <pic:pic>
+                  <pic:nvPicPr>
+                    <pic:cNvPr id="0" name="recommendation.png"/>
+                    <pic:cNvPicPr/>
+                  </pic:nvPicPr>
+                  <pic:blipFill>
+                    <a:blip r:embed="rId14"/>
+                    <a:stretch>
+                      <a:fillRect/>
+                    </a:stretch>
+                  </pic:blipFill>
+                  <pic:spPr>
+                    <a:xfrm>
+                      <a:off x="0" y="0"/>
+                      <a:ext cx="5623560" cy="2315584"/>
+                    </a:xfrm>
+                    <a:prstGeom prst="rect"/>
+                  </pic:spPr>
+                </pic:pic>
+              </a:graphicData>
+            </a:graphic>
+          </wp:inline>
+        </w:drawing>
+      </w:r>
+    </w:p>
+    <w:p>
+      <w:pPr>
+        <w:spacing w:after="200"/>
+        <w:jc w:val="center"/>
+      </w:pPr>
+      <w:r>
+        <w:rPr>
+          <w:rFonts w:ascii="Calibri" w:hAnsi="Calibri" w:eastAsia="Malgun Gothic"/>
+          <w:i/>
+          <w:color w:val="667085"/>
+          <w:sz w:val="17"/>
+        </w:rPr>
+        <w:t>화면 4. 최적 추천: 추천 업체, 브링 최종금액과 업체 정보를 확인한 뒤 건물주 발송·승인·입금 단계로 이어갑니다.</w:t>
       </w:r>
     </w:p>
     <w:p>

</xml_diff>